<commit_message>
Image delete and add thank you note to the report
</commit_message>
<xml_diff>
--- a/app/services/templates/report_en.docx
+++ b/app/services/templates/report_en.docx
@@ -678,10 +678,13 @@
           </w:tcPr>
           <w:p>
             <w:pPr>
-              <w:rPr/>
+              <w:rPr>
+                <w:color w:val="ffffff"/>
+              </w:rPr>
             </w:pPr>
             <w:r>
               <w:rPr>
+                <w:color w:val="ffffff"/>
                 <w:rtl w:val="0"/>
               </w:rPr>
               <w:t xml:space="preserve">{%tr for item in ratings %}</w:t>
@@ -840,10 +843,13 @@
           </w:tcPr>
           <w:p>
             <w:pPr>
-              <w:rPr/>
+              <w:rPr>
+                <w:color w:val="ffffff"/>
+              </w:rPr>
             </w:pPr>
             <w:r>
               <w:rPr>
+                <w:color w:val="ffffff"/>
                 <w:rtl w:val="0"/>
               </w:rPr>
               <w:t xml:space="preserve">{%tr endfor %}</w:t>
@@ -1027,32 +1033,6 @@
               </w:rPr>
             </w:r>
           </w:p>
-          <w:p>
-            <w:pPr>
-              <w:spacing w:after="60" w:before="40" w:lineRule="auto"/>
-              <w:jc w:val="left"/>
-              <w:rPr/>
-            </w:pPr>
-            <w:r>
-              <w:rPr>
-                <w:rFonts w:ascii="Arial" w:cs="Arial" w:eastAsia="Arial" w:hAnsi="Arial"/>
-                <w:b w:val="0"/>
-                <w:bCs w:val="0"/>
-                <w:i w:val="1"/>
-                <w:iCs w:val="1"/>
-                <w:color w:val="999999"/>
-                <w:sz w:val="16"/>
-                <w:szCs w:val="16"/>
-                <w:rtl w:val="0"/>
-              </w:rPr>
-              <w:t xml:space="preserve">(Pass an InlineImage from matplotlib/plotly as bar_chart)</w:t>
-            </w:r>
-            <w:r>
-              <w:rPr>
-                <w:rtl w:val="0"/>
-              </w:rPr>
-            </w:r>
-          </w:p>
         </w:tc>
       </w:tr>
     </w:tbl>
@@ -1082,125 +1062,8 @@
         </w:rPr>
       </w:pPr>
       <w:r>
-        <w:rPr>
-          <w:rtl w:val="0"/>
-        </w:rPr>
-      </w:r>
-    </w:p>
-    <w:p>
-      <w:pPr>
-        <w:pBdr>
-          <w:bottom w:color="e4d8cb" w:space="0" w:sz="4" w:val="single"/>
-        </w:pBdr>
-        <w:spacing w:after="100" w:before="200" w:lineRule="auto"/>
-        <w:rPr>
-          <w:b w:val="1"/>
-          <w:bCs w:val="1"/>
-          <w:color w:val="5b3a22"/>
-          <w:sz w:val="26"/>
-          <w:szCs w:val="26"/>
-        </w:rPr>
-      </w:pPr>
-      <w:r>
-        <w:rPr>
-          <w:rtl w:val="0"/>
-        </w:rPr>
-      </w:r>
-    </w:p>
-    <w:p>
-      <w:pPr>
-        <w:pBdr>
-          <w:bottom w:color="e4d8cb" w:space="0" w:sz="4" w:val="single"/>
-        </w:pBdr>
-        <w:spacing w:after="100" w:before="200" w:lineRule="auto"/>
-        <w:rPr>
-          <w:b w:val="1"/>
-          <w:bCs w:val="1"/>
-          <w:color w:val="5b3a22"/>
-          <w:sz w:val="26"/>
-          <w:szCs w:val="26"/>
-        </w:rPr>
-      </w:pPr>
-      <w:r>
-        <w:rPr>
-          <w:rtl w:val="0"/>
-        </w:rPr>
-      </w:r>
-    </w:p>
-    <w:p>
-      <w:pPr>
-        <w:pBdr>
-          <w:bottom w:color="e4d8cb" w:space="0" w:sz="4" w:val="single"/>
-        </w:pBdr>
-        <w:spacing w:after="100" w:before="200" w:lineRule="auto"/>
-        <w:rPr>
-          <w:b w:val="1"/>
-          <w:bCs w:val="1"/>
-          <w:color w:val="5b3a22"/>
-          <w:sz w:val="26"/>
-          <w:szCs w:val="26"/>
-        </w:rPr>
-      </w:pPr>
-      <w:r>
-        <w:rPr>
-          <w:rtl w:val="0"/>
-        </w:rPr>
-      </w:r>
-    </w:p>
-    <w:p>
-      <w:pPr>
-        <w:pBdr>
-          <w:bottom w:color="e4d8cb" w:space="0" w:sz="4" w:val="single"/>
-        </w:pBdr>
-        <w:spacing w:after="100" w:before="200" w:lineRule="auto"/>
-        <w:rPr>
-          <w:b w:val="1"/>
-          <w:bCs w:val="1"/>
-          <w:color w:val="5b3a22"/>
-          <w:sz w:val="26"/>
-          <w:szCs w:val="26"/>
-        </w:rPr>
-      </w:pPr>
-      <w:r>
-        <w:rPr>
-          <w:rtl w:val="0"/>
-        </w:rPr>
-      </w:r>
-    </w:p>
-    <w:p>
-      <w:pPr>
-        <w:pBdr>
-          <w:bottom w:color="e4d8cb" w:space="0" w:sz="4" w:val="single"/>
-        </w:pBdr>
-        <w:spacing w:after="100" w:before="200" w:lineRule="auto"/>
-        <w:rPr>
-          <w:b w:val="1"/>
-          <w:bCs w:val="1"/>
-          <w:color w:val="5b3a22"/>
-          <w:sz w:val="26"/>
-          <w:szCs w:val="26"/>
-        </w:rPr>
-      </w:pPr>
-      <w:r>
-        <w:rPr>
-          <w:rtl w:val="0"/>
-        </w:rPr>
-      </w:r>
-    </w:p>
-    <w:p>
-      <w:pPr>
-        <w:pBdr>
-          <w:bottom w:color="e4d8cb" w:space="0" w:sz="4" w:val="single"/>
-        </w:pBdr>
-        <w:spacing w:after="100" w:before="200" w:lineRule="auto"/>
-        <w:rPr>
-          <w:b w:val="1"/>
-          <w:bCs w:val="1"/>
-          <w:color w:val="5b3a22"/>
-          <w:sz w:val="26"/>
-          <w:szCs w:val="26"/>
-        </w:rPr>
-      </w:pPr>
+        <w:br w:type="page"/>
+      </w:r>
       <w:r>
         <w:rPr>
           <w:rtl w:val="0"/>
@@ -1238,7 +1101,7 @@
     <w:tbl>
       <w:tblPr>
         <w:tblStyle w:val="Table4"/>
-        <w:tblW w:w="15698.919999999998" w:type="dxa"/>
+        <w:tblW w:w="10350.0" w:type="dxa"/>
         <w:jc w:val="left"/>
         <w:tblBorders>
           <w:top w:color="000000" w:space="0" w:sz="4" w:val="single"/>
@@ -1252,19 +1115,18 @@
         <w:tblLook w:val="0000"/>
       </w:tblPr>
       <w:tblGrid>
-        <w:gridCol w:w="10465.919999999998"/>
-        <w:gridCol w:w="5233"/>
+        <w:gridCol w:w="5760"/>
+        <w:gridCol w:w="4590"/>
         <w:tblGridChange w:id="0">
           <w:tblGrid>
-            <w:gridCol w:w="10465.919999999998"/>
-            <w:gridCol w:w="5233"/>
+            <w:gridCol w:w="5760"/>
+            <w:gridCol w:w="4590"/>
           </w:tblGrid>
         </w:tblGridChange>
       </w:tblGrid>
       <w:tr>
         <w:trPr>
           <w:cantSplit w:val="0"/>
-          <w:trHeight w:val="8640" w:hRule="atLeast"/>
           <w:tblHeader w:val="0"/>
         </w:trPr>
         <w:tc>
@@ -1329,7 +1191,6 @@
       <w:tr>
         <w:trPr>
           <w:cantSplit w:val="0"/>
-          <w:trHeight w:val="8640" w:hRule="atLeast"/>
           <w:tblHeader w:val="0"/>
         </w:trPr>
         <w:tc>
@@ -1398,6 +1259,29 @@
         </w:tc>
       </w:tr>
     </w:tbl>
+    <w:p>
+      <w:pPr>
+        <w:pBdr>
+          <w:bottom w:color="e4d8cb" w:space="0" w:sz="4" w:val="single"/>
+        </w:pBdr>
+        <w:spacing w:after="100" w:before="200" w:lineRule="auto"/>
+        <w:rPr>
+          <w:b w:val="1"/>
+          <w:bCs w:val="1"/>
+          <w:color w:val="5b3a22"/>
+          <w:sz w:val="26"/>
+          <w:szCs w:val="26"/>
+        </w:rPr>
+      </w:pPr>
+      <w:r>
+        <w:br w:type="page"/>
+      </w:r>
+      <w:r>
+        <w:rPr>
+          <w:rtl w:val="0"/>
+        </w:rPr>
+      </w:r>
+    </w:p>
     <w:p>
       <w:pPr>
         <w:pBdr>
@@ -1720,10 +1604,13 @@
           </w:tcPr>
           <w:p>
             <w:pPr>
-              <w:rPr/>
+              <w:rPr>
+                <w:color w:val="ffffff"/>
+              </w:rPr>
             </w:pPr>
             <w:r>
               <w:rPr>
+                <w:color w:val="ffffff"/>
                 <w:rtl w:val="0"/>
               </w:rPr>
               <w:t xml:space="preserve">{%tr for room in ratings %}</w:t>
@@ -1955,6 +1842,7 @@
       <w:tr>
         <w:trPr>
           <w:cantSplit w:val="0"/>
+          <w:trHeight w:val="184.98046875" w:hRule="atLeast"/>
           <w:tblHeader w:val="0"/>
         </w:trPr>
         <w:tc>
@@ -1968,10 +1856,13 @@
           </w:tcPr>
           <w:p>
             <w:pPr>
-              <w:rPr/>
+              <w:rPr>
+                <w:color w:val="ffffff"/>
+              </w:rPr>
             </w:pPr>
             <w:r>
               <w:rPr>
+                <w:color w:val="ffffff"/>
                 <w:rtl w:val="0"/>
               </w:rPr>
               <w:t xml:space="preserve">{%tr endfor %}</w:t>
@@ -1980,37 +1871,6 @@
         </w:tc>
       </w:tr>
     </w:tbl>
-    <w:p>
-      <w:pPr>
-        <w:spacing w:after="0" w:before="200" w:lineRule="auto"/>
-        <w:rPr/>
-      </w:pPr>
-      <w:r>
-        <w:rPr>
-          <w:rtl w:val="0"/>
-        </w:rPr>
-      </w:r>
-    </w:p>
-    <w:p>
-      <w:pPr>
-        <w:pBdr>
-          <w:bottom w:color="e4d8cb" w:space="0" w:sz="4" w:val="single"/>
-        </w:pBdr>
-        <w:spacing w:after="100" w:before="200" w:lineRule="auto"/>
-        <w:rPr>
-          <w:b w:val="1"/>
-          <w:bCs w:val="1"/>
-          <w:color w:val="5b3a22"/>
-          <w:sz w:val="26"/>
-          <w:szCs w:val="26"/>
-        </w:rPr>
-      </w:pPr>
-      <w:r>
-        <w:rPr>
-          <w:rtl w:val="0"/>
-        </w:rPr>
-      </w:r>
-    </w:p>
     <w:p>
       <w:pPr>
         <w:pBdr>
@@ -2063,7 +1923,9 @@
       <w:pPr>
         <w:spacing w:after="80" w:before="0" w:lineRule="auto"/>
         <w:jc w:val="left"/>
-        <w:rPr/>
+        <w:rPr>
+          <w:color w:val="ffffff"/>
+        </w:rPr>
       </w:pPr>
       <w:r>
         <w:rPr>
@@ -2072,7 +1934,7 @@
           <w:bCs w:val="0"/>
           <w:i w:val="1"/>
           <w:iCs w:val="1"/>
-          <w:color w:val="999999"/>
+          <w:color w:val="ffffff"/>
           <w:sz w:val="16"/>
           <w:szCs w:val="16"/>
           <w:rtl w:val="0"/>
@@ -2221,10 +2083,13 @@
           </w:tcPr>
           <w:p>
             <w:pPr>
-              <w:rPr/>
+              <w:rPr>
+                <w:color w:val="ffffff"/>
+              </w:rPr>
             </w:pPr>
             <w:r>
               <w:rPr>
+                <w:color w:val="ffffff"/>
                 <w:rtl w:val="0"/>
               </w:rPr>
               <w:t xml:space="preserve">{%tr for pair in rating_pairs %}</w:t>
@@ -2360,10 +2225,13 @@
           </w:tcPr>
           <w:p>
             <w:pPr>
-              <w:rPr/>
+              <w:rPr>
+                <w:color w:val="ffffff"/>
+              </w:rPr>
             </w:pPr>
             <w:r>
               <w:rPr>
+                <w:color w:val="ffffff"/>
                 <w:rtl w:val="0"/>
               </w:rPr>
               <w:t xml:space="preserve">{%tr endfor %}</w:t>
@@ -2547,10 +2415,13 @@
           </w:tcPr>
           <w:p>
             <w:pPr>
-              <w:rPr/>
+              <w:rPr>
+                <w:color w:val="ffffff"/>
+              </w:rPr>
             </w:pPr>
             <w:r>
               <w:rPr>
+                <w:color w:val="ffffff"/>
                 <w:rtl w:val="0"/>
               </w:rPr>
               <w:t xml:space="preserve">{%tr for item in ratings %}</w:t>
@@ -2666,10 +2537,13 @@
           </w:tcPr>
           <w:p>
             <w:pPr>
-              <w:rPr/>
+              <w:rPr>
+                <w:color w:val="ffffff"/>
+              </w:rPr>
             </w:pPr>
             <w:r>
               <w:rPr>
+                <w:color w:val="ffffff"/>
                 <w:rtl w:val="0"/>
               </w:rPr>
               <w:t xml:space="preserve">{%tr endfor %}</w:t>
@@ -4599,7 +4473,16 @@
       <w:pPr>
         <w:spacing w:after="160" w:before="80" w:lineRule="auto"/>
         <w:jc w:val="left"/>
-        <w:rPr/>
+        <w:rPr>
+          <w:rFonts w:ascii="Arial" w:cs="Arial" w:eastAsia="Arial" w:hAnsi="Arial"/>
+          <w:b w:val="1"/>
+          <w:bCs w:val="1"/>
+          <w:i w:val="0"/>
+          <w:iCs w:val="0"/>
+          <w:color w:val="2b2b2b"/>
+          <w:sz w:val="20"/>
+          <w:szCs w:val="20"/>
+        </w:rPr>
       </w:pPr>
       <w:r>
         <w:rPr>
@@ -4643,6 +4526,212 @@
         </w:rPr>
         <w:t xml:space="preserve">True Vastu begins from within and reflects in your surroundings.</w:t>
       </w:r>
+    </w:p>
+    <w:p>
+      <w:pPr>
+        <w:spacing w:after="160" w:before="80" w:lineRule="auto"/>
+        <w:jc w:val="left"/>
+        <w:rPr>
+          <w:b w:val="1"/>
+          <w:bCs w:val="1"/>
+        </w:rPr>
+      </w:pPr>
+      <w:r>
+        <w:rPr>
+          <w:rtl w:val="0"/>
+        </w:rPr>
+      </w:r>
+    </w:p>
+    <w:p>
+      <w:pPr>
+        <w:spacing w:after="160" w:before="80" w:lineRule="auto"/>
+        <w:rPr>
+          <w:b w:val="1"/>
+          <w:bCs w:val="1"/>
+        </w:rPr>
+      </w:pPr>
+      <w:r>
+        <w:rPr>
+          <w:b w:val="1"/>
+          <w:bCs w:val="1"/>
+          <w:rtl w:val="0"/>
+        </w:rPr>
+        <w:t xml:space="preserve">🙏 Thank You!</w:t>
+      </w:r>
+    </w:p>
+    <w:p>
+      <w:pPr>
+        <w:spacing w:after="160" w:before="80" w:lineRule="auto"/>
+        <w:rPr>
+          <w:b w:val="1"/>
+          <w:bCs w:val="1"/>
+        </w:rPr>
+      </w:pPr>
+      <w:r>
+        <w:rPr>
+          <w:rtl w:val="0"/>
+        </w:rPr>
+      </w:r>
+    </w:p>
+    <w:p>
+      <w:pPr>
+        <w:spacing w:after="160" w:before="80" w:lineRule="auto"/>
+        <w:rPr>
+          <w:b w:val="1"/>
+          <w:bCs w:val="1"/>
+        </w:rPr>
+      </w:pPr>
+      <w:r>
+        <w:rPr>
+          <w:b w:val="1"/>
+          <w:bCs w:val="1"/>
+          <w:rtl w:val="0"/>
+        </w:rPr>
+        <w:t xml:space="preserve">Thank you for choosing Spiritual Hut Academy of Occult Science for your Vastu Analysis.</w:t>
+      </w:r>
+    </w:p>
+    <w:p>
+      <w:pPr>
+        <w:spacing w:after="160" w:before="80" w:lineRule="auto"/>
+        <w:rPr>
+          <w:b w:val="1"/>
+          <w:bCs w:val="1"/>
+        </w:rPr>
+      </w:pPr>
+      <w:r>
+        <w:rPr>
+          <w:rtl w:val="0"/>
+        </w:rPr>
+      </w:r>
+    </w:p>
+    <w:p>
+      <w:pPr>
+        <w:spacing w:after="160" w:before="80" w:lineRule="auto"/>
+        <w:rPr>
+          <w:b w:val="1"/>
+          <w:bCs w:val="1"/>
+        </w:rPr>
+      </w:pPr>
+      <w:r>
+        <w:rPr>
+          <w:b w:val="1"/>
+          <w:bCs w:val="1"/>
+          <w:rtl w:val="0"/>
+        </w:rPr>
+        <w:t xml:space="preserve">We hope this report helps you create a space filled with positivity, harmony, health, happiness, and prosperity.</w:t>
+      </w:r>
+    </w:p>
+    <w:p>
+      <w:pPr>
+        <w:spacing w:after="160" w:before="80" w:lineRule="auto"/>
+        <w:rPr>
+          <w:b w:val="1"/>
+          <w:bCs w:val="1"/>
+        </w:rPr>
+      </w:pPr>
+      <w:r>
+        <w:rPr>
+          <w:rtl w:val="0"/>
+        </w:rPr>
+      </w:r>
+    </w:p>
+    <w:p>
+      <w:pPr>
+        <w:spacing w:after="160" w:before="80" w:lineRule="auto"/>
+        <w:rPr>
+          <w:b w:val="1"/>
+          <w:bCs w:val="1"/>
+        </w:rPr>
+      </w:pPr>
+      <w:r>
+        <w:rPr>
+          <w:b w:val="1"/>
+          <w:bCs w:val="1"/>
+          <w:rtl w:val="0"/>
+        </w:rPr>
+        <w:t xml:space="preserve">For any clarification or personalized guidance regarding this report, feel free to contact us. We are always happy to assist you on your journey towards a balanced and successful life.</w:t>
+      </w:r>
+    </w:p>
+    <w:p>
+      <w:pPr>
+        <w:spacing w:after="160" w:before="80" w:lineRule="auto"/>
+        <w:rPr>
+          <w:b w:val="1"/>
+          <w:bCs w:val="1"/>
+        </w:rPr>
+      </w:pPr>
+      <w:r>
+        <w:rPr>
+          <w:rtl w:val="0"/>
+        </w:rPr>
+      </w:r>
+    </w:p>
+    <w:p>
+      <w:pPr>
+        <w:spacing w:after="160" w:before="80" w:lineRule="auto"/>
+        <w:rPr>
+          <w:b w:val="1"/>
+          <w:bCs w:val="1"/>
+        </w:rPr>
+      </w:pPr>
+      <w:sdt>
+        <w:sdtPr>
+          <w:id w:val="-1447281998"/>
+          <w:tag w:val="goog_rdk_0"/>
+        </w:sdtPr>
+        <w:sdtContent>
+          <w:r>
+            <w:rPr>
+              <w:rFonts w:ascii="Arial Unicode MS" w:cs="Arial Unicode MS" w:eastAsia="Arial Unicode MS" w:hAnsi="Arial Unicode MS"/>
+              <w:b w:val="1"/>
+              <w:bCs w:val="1"/>
+              <w:rtl w:val="0"/>
+            </w:rPr>
+            <w:t xml:space="preserve">Wishing you abundant success, peace, and positive energy! ✨</w:t>
+          </w:r>
+        </w:sdtContent>
+      </w:sdt>
+    </w:p>
+    <w:p>
+      <w:pPr>
+        <w:spacing w:after="160" w:before="80" w:lineRule="auto"/>
+        <w:rPr>
+          <w:b w:val="1"/>
+          <w:bCs w:val="1"/>
+        </w:rPr>
+      </w:pPr>
+      <w:r>
+        <w:rPr>
+          <w:rtl w:val="0"/>
+        </w:rPr>
+      </w:r>
+    </w:p>
+    <w:p>
+      <w:pPr>
+        <w:spacing w:after="160" w:before="80" w:lineRule="auto"/>
+        <w:rPr>
+          <w:b w:val="1"/>
+          <w:bCs w:val="1"/>
+        </w:rPr>
+      </w:pPr>
+      <w:r>
+        <w:rPr>
+          <w:b w:val="1"/>
+          <w:bCs w:val="1"/>
+          <w:rtl w:val="0"/>
+        </w:rPr>
+        <w:t xml:space="preserve">Team Spiritual Hut Academy of Occult Science</w:t>
+      </w:r>
+    </w:p>
+    <w:p>
+      <w:pPr>
+        <w:spacing w:after="160" w:before="80" w:lineRule="auto"/>
+        <w:jc w:val="left"/>
+        <w:rPr>
+          <w:b w:val="1"/>
+          <w:bCs w:val="1"/>
+        </w:rPr>
+      </w:pPr>
       <w:r>
         <w:rPr>
           <w:rtl w:val="0"/>
@@ -5797,7 +5886,7 @@
 
 <file path=customXML/item1.xml><?xml version="1.0" encoding="utf-8"?>
 <go:gDocsCustomXmlDataStorage xmlns:go="http://customooxmlschemas.google.com/" xmlns:r="http://schemas.openxmlformats.org/officeDocument/2006/relationships" uri="GoogleDocsCustomDataVersion2">
-  <go:docsCustomData xmlns:go="http://customooxmlschemas.google.com/" roundtripDataSignature="AMtx7mg7qHOLiFtvC703LJIk0nQ6Ov/3JA==">CgMxLjA4AHIhMWdfQ1N2dWRVMnFzVFd5ZFhGSVdEVlJLR3MyYWNQaDRG</go:docsCustomData>
+  <go:docsCustomData xmlns:go="http://customooxmlschemas.google.com/" roundtripDataSignature="AMtx7mgVYUwIpj7YdIHHwh1NhOhjpoFjVw==">CgMxLjAaHQoBMBIYChYIB0ISEhBBcmlhbCBVbmljb2RlIE1TOAByITFnX0NTdnVkVTJxc1RXeWRYRklXRFZSS0dzMmFjUGg0Rg==</go:docsCustomData>
 </go:gDocsCustomXmlDataStorage>
 </file>
 

</xml_diff>

<commit_message>
Use suggested remedies in Word report templates.
Match the PDF section 7 heading and sug_remedy placeholders in the EN/HI/MR docx templates.
</commit_message>
<xml_diff>
--- a/app/services/templates/report_en.docx
+++ b/app/services/templates/report_en.docx
@@ -2271,7 +2271,7 @@
           <w:szCs w:val="26"/>
           <w:rtl w:val="0"/>
         </w:rPr>
-        <w:t xml:space="preserve">7. Suggested Remedies</w:t>
+        <w:t xml:space="preserve">7. Suggested Remedies (Pyramids/Ratna/Yantra/Crystals)</w:t>
       </w:r>
       <w:r>
         <w:rPr>
@@ -2511,7 +2511,7 @@
                 <w:szCs w:val="20"/>
                 <w:rtl w:val="0"/>
               </w:rPr>
-              <w:t xml:space="preserve">{{ item.remedy }}</w:t>
+              <w:t xml:space="preserve">{{ item.sug_remedy }}</w:t>
             </w:r>
             <w:r>
               <w:rPr>

</xml_diff>

<commit_message>
Add 16-direction Vastu appendix to PDF and Word reports.
Append the extra EN/HI/MR content and images as the last report section, matching existing template styling.
</commit_message>
<xml_diff>
--- a/app/services/templates/report_en.docx
+++ b/app/services/templates/report_en.docx
@@ -4731,6 +4731,2115 @@
           <w:b w:val="1"/>
           <w:bCs w:val="1"/>
         </w:rPr>
+      </w:pPr>
+      <w:r>
+        <w:rPr>
+          <w:rtl w:val="0"/>
+        </w:rPr>
+      </w:r>
+    </w:p>
+    <w:p>
+      <w:pPr>
+        <w:pStyle w:val="Heading1"/>
+        <w:keepNext w:val="0"/>
+        <w:keepLines w:val="0"/>
+        <w:spacing w:before="480" w:lineRule="auto"/>
+        <w:rPr>
+          <w:b w:val="1"/>
+          <w:bCs w:val="1"/>
+          <w:sz w:val="46"/>
+          <w:szCs w:val="46"/>
+        </w:rPr>
+      </w:pPr>
+      <w:bookmarkStart w:colFirst="0" w:colLast="0" w:name="_jlkjih9yatxm" w:id="0"/>
+      <w:bookmarkEnd w:id="0"/>
+      <w:r>
+        <w:rPr>
+          <w:b w:val="1"/>
+          <w:bCs w:val="1"/>
+          <w:sz w:val="46"/>
+          <w:szCs w:val="46"/>
+          <w:rtl w:val="0"/>
+        </w:rPr>
+        <w:t xml:space="preserve">16 Directions According to Vastu – Ideal House Directions</w:t>
+      </w:r>
+    </w:p>
+    <w:p>
+      <w:pPr>
+        <w:rPr/>
+      </w:pPr>
+      <w:r>
+        <w:rPr>
+          <w:b w:val="1"/>
+          <w:bCs w:val="1"/>
+          <w:sz w:val="26"/>
+          <w:szCs w:val="26"/>
+        </w:rPr>
+        <w:drawing>
+          <wp:inline distB="114300" distT="114300" distL="114300" distR="114300">
+            <wp:extent cx="5731200" cy="5727700"/>
+            <wp:effectExtent b="0" l="0" r="0" t="0"/>
+            <wp:docPr descr="Mahavastu -A Science" id="1" name="image3.jpg"/>
+            <a:graphic>
+              <a:graphicData uri="http://schemas.openxmlformats.org/drawingml/2006/picture">
+                <pic:pic>
+                  <pic:nvPicPr>
+                    <pic:cNvPr descr="Mahavastu -A Science" id="0" name="image3.jpg"/>
+                    <pic:cNvPicPr preferRelativeResize="0"/>
+                  </pic:nvPicPr>
+                  <pic:blipFill>
+                    <a:blip r:embed="rId10"/>
+                    <a:srcRect b="0" l="0" r="0" t="0"/>
+                    <a:stretch>
+                      <a:fillRect/>
+                    </a:stretch>
+                  </pic:blipFill>
+                  <pic:spPr>
+                    <a:xfrm>
+                      <a:off x="0" y="0"/>
+                      <a:ext cx="5731200" cy="5727700"/>
+                    </a:xfrm>
+                    <a:prstGeom prst="rect"/>
+                    <a:ln/>
+                  </pic:spPr>
+                </pic:pic>
+              </a:graphicData>
+            </a:graphic>
+          </wp:inline>
+        </w:drawing>
+      </w:r>
+      <w:r>
+        <w:rPr>
+          <w:rtl w:val="0"/>
+        </w:rPr>
+      </w:r>
+    </w:p>
+    <w:p>
+      <w:pPr>
+        <w:spacing w:after="240" w:before="240" w:lineRule="auto"/>
+        <w:rPr>
+          <w:b w:val="1"/>
+          <w:bCs w:val="1"/>
+          <w:sz w:val="26"/>
+          <w:szCs w:val="26"/>
+        </w:rPr>
+      </w:pPr>
+      <w:r>
+        <w:rPr>
+          <w:b w:val="1"/>
+          <w:bCs w:val="1"/>
+          <w:sz w:val="26"/>
+          <w:szCs w:val="26"/>
+          <w:rtl w:val="0"/>
+        </w:rPr>
+        <w:t xml:space="preserve">If you want to understand what should ideally be placed in each direction of a house according to the 16-Direction Vastu Model, the following chart is useful. This approach is based on the Vastu Purusha Mandala and the 16-Zone Vastu System.</w:t>
+      </w:r>
+    </w:p>
+    <w:p>
+      <w:pPr>
+        <w:pStyle w:val="Heading2"/>
+        <w:keepNext w:val="0"/>
+        <w:keepLines w:val="0"/>
+        <w:spacing w:after="80" w:lineRule="auto"/>
+        <w:rPr>
+          <w:b w:val="1"/>
+          <w:bCs w:val="1"/>
+          <w:sz w:val="34"/>
+          <w:szCs w:val="34"/>
+        </w:rPr>
+      </w:pPr>
+      <w:bookmarkStart w:colFirst="0" w:colLast="0" w:name="_ki0ptp7grq2d" w:id="1"/>
+      <w:bookmarkEnd w:id="1"/>
+      <w:r>
+        <w:rPr>
+          <w:b w:val="1"/>
+          <w:bCs w:val="1"/>
+          <w:sz w:val="34"/>
+          <w:szCs w:val="34"/>
+          <w:rtl w:val="0"/>
+        </w:rPr>
+        <w:t xml:space="preserve">Complete Chart of 16 Directions</w:t>
+      </w:r>
+    </w:p>
+    <w:p>
+      <w:pPr>
+        <w:rPr/>
+      </w:pPr>
+      <w:r>
+        <w:rPr>
+          <w:b w:val="1"/>
+          <w:bCs w:val="1"/>
+          <w:sz w:val="26"/>
+          <w:szCs w:val="26"/>
+        </w:rPr>
+        <w:drawing>
+          <wp:inline distB="114300" distT="114300" distL="114300" distR="114300">
+            <wp:extent cx="4200525" cy="4562475"/>
+            <wp:effectExtent b="0" l="0" r="0" t="0"/>
+            <wp:docPr descr="Vastu Colors for Each Zone" id="2" name="image1.jpg"/>
+            <a:graphic>
+              <a:graphicData uri="http://schemas.openxmlformats.org/drawingml/2006/picture">
+                <pic:pic>
+                  <pic:nvPicPr>
+                    <pic:cNvPr descr="Vastu Colors for Each Zone" id="0" name="image1.jpg"/>
+                    <pic:cNvPicPr preferRelativeResize="0"/>
+                  </pic:nvPicPr>
+                  <pic:blipFill>
+                    <a:blip r:embed="rId11"/>
+                    <a:srcRect b="0" l="0" r="0" t="0"/>
+                    <a:stretch>
+                      <a:fillRect/>
+                    </a:stretch>
+                  </pic:blipFill>
+                  <pic:spPr>
+                    <a:xfrm>
+                      <a:off x="0" y="0"/>
+                      <a:ext cx="4200525" cy="4562475"/>
+                    </a:xfrm>
+                    <a:prstGeom prst="rect"/>
+                    <a:ln/>
+                  </pic:spPr>
+                </pic:pic>
+              </a:graphicData>
+            </a:graphic>
+          </wp:inline>
+        </w:drawing>
+      </w:r>
+      <w:r>
+        <w:rPr>
+          <w:rtl w:val="0"/>
+        </w:rPr>
+      </w:r>
+    </w:p>
+    <w:tbl>
+      <w:tblPr>
+        <w:tblStyle w:val="Table1"/>
+        <w:tblW w:w="8275.0" w:type="dxa"/>
+        <w:jc w:val="left"/>
+        <w:tblBorders>
+          <w:top w:color="000000" w:space="0" w:sz="0" w:val="nil"/>
+          <w:left w:color="000000" w:space="0" w:sz="0" w:val="nil"/>
+          <w:bottom w:color="000000" w:space="0" w:sz="0" w:val="nil"/>
+          <w:right w:color="000000" w:space="0" w:sz="0" w:val="nil"/>
+          <w:insideH w:color="000000" w:space="0" w:sz="0" w:val="nil"/>
+          <w:insideV w:color="000000" w:space="0" w:sz="0" w:val="nil"/>
+        </w:tblBorders>
+        <w:tblLayout w:type="fixed"/>
+        <w:tblLook w:val="0600"/>
+      </w:tblPr>
+      <w:tblGrid>
+        <w:gridCol w:w="2060"/>
+        <w:gridCol w:w="6215"/>
+        <w:tblGridChange w:id="0">
+          <w:tblGrid>
+            <w:gridCol w:w="2060"/>
+            <w:gridCol w:w="6215"/>
+          </w:tblGrid>
+        </w:tblGridChange>
+      </w:tblGrid>
+      <w:tr>
+        <w:trPr>
+          <w:cantSplit w:val="0"/>
+          <w:trHeight w:val="500" w:hRule="atLeast"/>
+          <w:tblHeader w:val="0"/>
+        </w:trPr>
+        <w:tc>
+          <w:tcPr>
+            <w:tcBorders>
+              <w:top w:color="000000" w:space="0" w:sz="0" w:val="nil"/>
+              <w:left w:color="000000" w:space="0" w:sz="0" w:val="nil"/>
+              <w:bottom w:color="000000" w:space="0" w:sz="0" w:val="nil"/>
+              <w:right w:color="000000" w:space="0" w:sz="0" w:val="nil"/>
+            </w:tcBorders>
+            <w:tcMar>
+              <w:top w:w="100.0" w:type="dxa"/>
+              <w:left w:w="100.0" w:type="dxa"/>
+              <w:bottom w:w="100.0" w:type="dxa"/>
+              <w:right w:w="100.0" w:type="dxa"/>
+            </w:tcMar>
+            <w:vAlign w:val="top"/>
+          </w:tcPr>
+          <w:p>
+            <w:pPr>
+              <w:jc w:val="center"/>
+              <w:rPr>
+                <w:b w:val="1"/>
+                <w:bCs w:val="1"/>
+                <w:sz w:val="26"/>
+                <w:szCs w:val="26"/>
+              </w:rPr>
+            </w:pPr>
+            <w:r>
+              <w:rPr>
+                <w:b w:val="1"/>
+                <w:bCs w:val="1"/>
+                <w:sz w:val="26"/>
+                <w:szCs w:val="26"/>
+                <w:rtl w:val="0"/>
+              </w:rPr>
+              <w:t xml:space="preserve">Direction</w:t>
+            </w:r>
+          </w:p>
+        </w:tc>
+        <w:tc>
+          <w:tcPr>
+            <w:tcBorders>
+              <w:top w:color="000000" w:space="0" w:sz="0" w:val="nil"/>
+              <w:left w:color="000000" w:space="0" w:sz="0" w:val="nil"/>
+              <w:bottom w:color="000000" w:space="0" w:sz="0" w:val="nil"/>
+              <w:right w:color="000000" w:space="0" w:sz="0" w:val="nil"/>
+            </w:tcBorders>
+            <w:tcMar>
+              <w:top w:w="100.0" w:type="dxa"/>
+              <w:left w:w="100.0" w:type="dxa"/>
+              <w:bottom w:w="100.0" w:type="dxa"/>
+              <w:right w:w="100.0" w:type="dxa"/>
+            </w:tcMar>
+            <w:vAlign w:val="top"/>
+          </w:tcPr>
+          <w:p>
+            <w:pPr>
+              <w:jc w:val="center"/>
+              <w:rPr>
+                <w:b w:val="1"/>
+                <w:bCs w:val="1"/>
+                <w:sz w:val="26"/>
+                <w:szCs w:val="26"/>
+              </w:rPr>
+            </w:pPr>
+            <w:r>
+              <w:rPr>
+                <w:b w:val="1"/>
+                <w:bCs w:val="1"/>
+                <w:sz w:val="26"/>
+                <w:szCs w:val="26"/>
+                <w:rtl w:val="0"/>
+              </w:rPr>
+              <w:t xml:space="preserve">Ideal Use</w:t>
+            </w:r>
+          </w:p>
+        </w:tc>
+      </w:tr>
+      <w:tr>
+        <w:trPr>
+          <w:cantSplit w:val="0"/>
+          <w:trHeight w:val="500" w:hRule="atLeast"/>
+          <w:tblHeader w:val="0"/>
+        </w:trPr>
+        <w:tc>
+          <w:tcPr>
+            <w:tcBorders>
+              <w:top w:color="000000" w:space="0" w:sz="0" w:val="nil"/>
+              <w:left w:color="000000" w:space="0" w:sz="0" w:val="nil"/>
+              <w:bottom w:color="000000" w:space="0" w:sz="0" w:val="nil"/>
+              <w:right w:color="000000" w:space="0" w:sz="0" w:val="nil"/>
+            </w:tcBorders>
+            <w:tcMar>
+              <w:top w:w="100.0" w:type="dxa"/>
+              <w:left w:w="100.0" w:type="dxa"/>
+              <w:bottom w:w="100.0" w:type="dxa"/>
+              <w:right w:w="100.0" w:type="dxa"/>
+            </w:tcMar>
+            <w:vAlign w:val="top"/>
+          </w:tcPr>
+          <w:p>
+            <w:pPr>
+              <w:rPr>
+                <w:b w:val="1"/>
+                <w:bCs w:val="1"/>
+                <w:sz w:val="26"/>
+                <w:szCs w:val="26"/>
+              </w:rPr>
+            </w:pPr>
+            <w:r>
+              <w:rPr>
+                <w:b w:val="1"/>
+                <w:bCs w:val="1"/>
+                <w:sz w:val="26"/>
+                <w:szCs w:val="26"/>
+                <w:rtl w:val="0"/>
+              </w:rPr>
+              <w:t xml:space="preserve">N (North)</w:t>
+            </w:r>
+          </w:p>
+        </w:tc>
+        <w:tc>
+          <w:tcPr>
+            <w:tcBorders>
+              <w:top w:color="000000" w:space="0" w:sz="0" w:val="nil"/>
+              <w:left w:color="000000" w:space="0" w:sz="0" w:val="nil"/>
+              <w:bottom w:color="000000" w:space="0" w:sz="0" w:val="nil"/>
+              <w:right w:color="000000" w:space="0" w:sz="0" w:val="nil"/>
+            </w:tcBorders>
+            <w:tcMar>
+              <w:top w:w="100.0" w:type="dxa"/>
+              <w:left w:w="100.0" w:type="dxa"/>
+              <w:bottom w:w="100.0" w:type="dxa"/>
+              <w:right w:w="100.0" w:type="dxa"/>
+            </w:tcMar>
+            <w:vAlign w:val="top"/>
+          </w:tcPr>
+          <w:p>
+            <w:pPr>
+              <w:rPr>
+                <w:b w:val="1"/>
+                <w:bCs w:val="1"/>
+                <w:sz w:val="26"/>
+                <w:szCs w:val="26"/>
+              </w:rPr>
+            </w:pPr>
+            <w:r>
+              <w:rPr>
+                <w:b w:val="1"/>
+                <w:bCs w:val="1"/>
+                <w:sz w:val="26"/>
+                <w:szCs w:val="26"/>
+                <w:rtl w:val="0"/>
+              </w:rPr>
+              <w:t xml:space="preserve">Wealth, office, cash locker, career opportunities</w:t>
+            </w:r>
+          </w:p>
+        </w:tc>
+      </w:tr>
+      <w:tr>
+        <w:trPr>
+          <w:cantSplit w:val="0"/>
+          <w:trHeight w:val="500" w:hRule="atLeast"/>
+          <w:tblHeader w:val="0"/>
+        </w:trPr>
+        <w:tc>
+          <w:tcPr>
+            <w:tcBorders>
+              <w:top w:color="000000" w:space="0" w:sz="0" w:val="nil"/>
+              <w:left w:color="000000" w:space="0" w:sz="0" w:val="nil"/>
+              <w:bottom w:color="000000" w:space="0" w:sz="0" w:val="nil"/>
+              <w:right w:color="000000" w:space="0" w:sz="0" w:val="nil"/>
+            </w:tcBorders>
+            <w:tcMar>
+              <w:top w:w="100.0" w:type="dxa"/>
+              <w:left w:w="100.0" w:type="dxa"/>
+              <w:bottom w:w="100.0" w:type="dxa"/>
+              <w:right w:w="100.0" w:type="dxa"/>
+            </w:tcMar>
+            <w:vAlign w:val="top"/>
+          </w:tcPr>
+          <w:p>
+            <w:pPr>
+              <w:rPr>
+                <w:b w:val="1"/>
+                <w:bCs w:val="1"/>
+                <w:sz w:val="26"/>
+                <w:szCs w:val="26"/>
+              </w:rPr>
+            </w:pPr>
+            <w:r>
+              <w:rPr>
+                <w:b w:val="1"/>
+                <w:bCs w:val="1"/>
+                <w:sz w:val="26"/>
+                <w:szCs w:val="26"/>
+                <w:rtl w:val="0"/>
+              </w:rPr>
+              <w:t xml:space="preserve">NNE</w:t>
+            </w:r>
+          </w:p>
+        </w:tc>
+        <w:tc>
+          <w:tcPr>
+            <w:tcBorders>
+              <w:top w:color="000000" w:space="0" w:sz="0" w:val="nil"/>
+              <w:left w:color="000000" w:space="0" w:sz="0" w:val="nil"/>
+              <w:bottom w:color="000000" w:space="0" w:sz="0" w:val="nil"/>
+              <w:right w:color="000000" w:space="0" w:sz="0" w:val="nil"/>
+            </w:tcBorders>
+            <w:tcMar>
+              <w:top w:w="100.0" w:type="dxa"/>
+              <w:left w:w="100.0" w:type="dxa"/>
+              <w:bottom w:w="100.0" w:type="dxa"/>
+              <w:right w:w="100.0" w:type="dxa"/>
+            </w:tcMar>
+            <w:vAlign w:val="top"/>
+          </w:tcPr>
+          <w:p>
+            <w:pPr>
+              <w:rPr>
+                <w:b w:val="1"/>
+                <w:bCs w:val="1"/>
+                <w:sz w:val="26"/>
+                <w:szCs w:val="26"/>
+              </w:rPr>
+            </w:pPr>
+            <w:r>
+              <w:rPr>
+                <w:b w:val="1"/>
+                <w:bCs w:val="1"/>
+                <w:sz w:val="26"/>
+                <w:szCs w:val="26"/>
+                <w:rtl w:val="0"/>
+              </w:rPr>
+              <w:t xml:space="preserve">Health, meditation, water-related arrangements</w:t>
+            </w:r>
+          </w:p>
+        </w:tc>
+      </w:tr>
+      <w:tr>
+        <w:trPr>
+          <w:cantSplit w:val="0"/>
+          <w:trHeight w:val="545" w:hRule="atLeast"/>
+          <w:tblHeader w:val="0"/>
+        </w:trPr>
+        <w:tc>
+          <w:tcPr>
+            <w:tcBorders>
+              <w:top w:color="000000" w:space="0" w:sz="0" w:val="nil"/>
+              <w:left w:color="000000" w:space="0" w:sz="0" w:val="nil"/>
+              <w:bottom w:color="000000" w:space="0" w:sz="0" w:val="nil"/>
+              <w:right w:color="000000" w:space="0" w:sz="0" w:val="nil"/>
+            </w:tcBorders>
+            <w:tcMar>
+              <w:top w:w="100.0" w:type="dxa"/>
+              <w:left w:w="100.0" w:type="dxa"/>
+              <w:bottom w:w="100.0" w:type="dxa"/>
+              <w:right w:w="100.0" w:type="dxa"/>
+            </w:tcMar>
+            <w:vAlign w:val="top"/>
+          </w:tcPr>
+          <w:p>
+            <w:pPr>
+              <w:rPr>
+                <w:b w:val="1"/>
+                <w:bCs w:val="1"/>
+                <w:sz w:val="26"/>
+                <w:szCs w:val="26"/>
+              </w:rPr>
+            </w:pPr>
+            <w:r>
+              <w:rPr>
+                <w:b w:val="1"/>
+                <w:bCs w:val="1"/>
+                <w:sz w:val="26"/>
+                <w:szCs w:val="26"/>
+                <w:rtl w:val="0"/>
+              </w:rPr>
+              <w:t xml:space="preserve">NE (North-East)</w:t>
+            </w:r>
+          </w:p>
+        </w:tc>
+        <w:tc>
+          <w:tcPr>
+            <w:tcBorders>
+              <w:top w:color="000000" w:space="0" w:sz="0" w:val="nil"/>
+              <w:left w:color="000000" w:space="0" w:sz="0" w:val="nil"/>
+              <w:bottom w:color="000000" w:space="0" w:sz="0" w:val="nil"/>
+              <w:right w:color="000000" w:space="0" w:sz="0" w:val="nil"/>
+            </w:tcBorders>
+            <w:tcMar>
+              <w:top w:w="100.0" w:type="dxa"/>
+              <w:left w:w="100.0" w:type="dxa"/>
+              <w:bottom w:w="100.0" w:type="dxa"/>
+              <w:right w:w="100.0" w:type="dxa"/>
+            </w:tcMar>
+            <w:vAlign w:val="top"/>
+          </w:tcPr>
+          <w:p>
+            <w:pPr>
+              <w:rPr>
+                <w:b w:val="1"/>
+                <w:bCs w:val="1"/>
+                <w:sz w:val="26"/>
+                <w:szCs w:val="26"/>
+              </w:rPr>
+            </w:pPr>
+            <w:r>
+              <w:rPr>
+                <w:rFonts w:ascii="Palanquin Dark" w:cs="Palanquin Dark" w:eastAsia="Palanquin Dark" w:hAnsi="Palanquin Dark"/>
+                <w:b w:val="1"/>
+                <w:bCs w:val="1"/>
+                <w:sz w:val="26"/>
+                <w:szCs w:val="26"/>
+                <w:rtl w:val="0"/>
+              </w:rPr>
+              <w:t xml:space="preserve">Temple, पूजा/meditation, water, open space</w:t>
+            </w:r>
+          </w:p>
+        </w:tc>
+      </w:tr>
+      <w:tr>
+        <w:trPr>
+          <w:cantSplit w:val="0"/>
+          <w:trHeight w:val="500" w:hRule="atLeast"/>
+          <w:tblHeader w:val="0"/>
+        </w:trPr>
+        <w:tc>
+          <w:tcPr>
+            <w:tcBorders>
+              <w:top w:color="000000" w:space="0" w:sz="0" w:val="nil"/>
+              <w:left w:color="000000" w:space="0" w:sz="0" w:val="nil"/>
+              <w:bottom w:color="000000" w:space="0" w:sz="0" w:val="nil"/>
+              <w:right w:color="000000" w:space="0" w:sz="0" w:val="nil"/>
+            </w:tcBorders>
+            <w:tcMar>
+              <w:top w:w="100.0" w:type="dxa"/>
+              <w:left w:w="100.0" w:type="dxa"/>
+              <w:bottom w:w="100.0" w:type="dxa"/>
+              <w:right w:w="100.0" w:type="dxa"/>
+            </w:tcMar>
+            <w:vAlign w:val="top"/>
+          </w:tcPr>
+          <w:p>
+            <w:pPr>
+              <w:rPr>
+                <w:b w:val="1"/>
+                <w:bCs w:val="1"/>
+                <w:sz w:val="26"/>
+                <w:szCs w:val="26"/>
+              </w:rPr>
+            </w:pPr>
+            <w:r>
+              <w:rPr>
+                <w:b w:val="1"/>
+                <w:bCs w:val="1"/>
+                <w:sz w:val="26"/>
+                <w:szCs w:val="26"/>
+                <w:rtl w:val="0"/>
+              </w:rPr>
+              <w:t xml:space="preserve">ENE</w:t>
+            </w:r>
+          </w:p>
+        </w:tc>
+        <w:tc>
+          <w:tcPr>
+            <w:tcBorders>
+              <w:top w:color="000000" w:space="0" w:sz="0" w:val="nil"/>
+              <w:left w:color="000000" w:space="0" w:sz="0" w:val="nil"/>
+              <w:bottom w:color="000000" w:space="0" w:sz="0" w:val="nil"/>
+              <w:right w:color="000000" w:space="0" w:sz="0" w:val="nil"/>
+            </w:tcBorders>
+            <w:tcMar>
+              <w:top w:w="100.0" w:type="dxa"/>
+              <w:left w:w="100.0" w:type="dxa"/>
+              <w:bottom w:w="100.0" w:type="dxa"/>
+              <w:right w:w="100.0" w:type="dxa"/>
+            </w:tcMar>
+            <w:vAlign w:val="top"/>
+          </w:tcPr>
+          <w:p>
+            <w:pPr>
+              <w:rPr>
+                <w:b w:val="1"/>
+                <w:bCs w:val="1"/>
+                <w:sz w:val="26"/>
+                <w:szCs w:val="26"/>
+              </w:rPr>
+            </w:pPr>
+            <w:r>
+              <w:rPr>
+                <w:b w:val="1"/>
+                <w:bCs w:val="1"/>
+                <w:sz w:val="26"/>
+                <w:szCs w:val="26"/>
+                <w:rtl w:val="0"/>
+              </w:rPr>
+              <w:t xml:space="preserve">Study, children's study area, learning activities</w:t>
+            </w:r>
+          </w:p>
+        </w:tc>
+      </w:tr>
+      <w:tr>
+        <w:trPr>
+          <w:cantSplit w:val="0"/>
+          <w:trHeight w:val="500" w:hRule="atLeast"/>
+          <w:tblHeader w:val="0"/>
+        </w:trPr>
+        <w:tc>
+          <w:tcPr>
+            <w:tcBorders>
+              <w:top w:color="000000" w:space="0" w:sz="0" w:val="nil"/>
+              <w:left w:color="000000" w:space="0" w:sz="0" w:val="nil"/>
+              <w:bottom w:color="000000" w:space="0" w:sz="0" w:val="nil"/>
+              <w:right w:color="000000" w:space="0" w:sz="0" w:val="nil"/>
+            </w:tcBorders>
+            <w:tcMar>
+              <w:top w:w="100.0" w:type="dxa"/>
+              <w:left w:w="100.0" w:type="dxa"/>
+              <w:bottom w:w="100.0" w:type="dxa"/>
+              <w:right w:w="100.0" w:type="dxa"/>
+            </w:tcMar>
+            <w:vAlign w:val="top"/>
+          </w:tcPr>
+          <w:p>
+            <w:pPr>
+              <w:rPr>
+                <w:b w:val="1"/>
+                <w:bCs w:val="1"/>
+                <w:sz w:val="26"/>
+                <w:szCs w:val="26"/>
+              </w:rPr>
+            </w:pPr>
+            <w:r>
+              <w:rPr>
+                <w:b w:val="1"/>
+                <w:bCs w:val="1"/>
+                <w:sz w:val="26"/>
+                <w:szCs w:val="26"/>
+                <w:rtl w:val="0"/>
+              </w:rPr>
+              <w:t xml:space="preserve">E (East)</w:t>
+            </w:r>
+          </w:p>
+        </w:tc>
+        <w:tc>
+          <w:tcPr>
+            <w:tcBorders>
+              <w:top w:color="000000" w:space="0" w:sz="0" w:val="nil"/>
+              <w:left w:color="000000" w:space="0" w:sz="0" w:val="nil"/>
+              <w:bottom w:color="000000" w:space="0" w:sz="0" w:val="nil"/>
+              <w:right w:color="000000" w:space="0" w:sz="0" w:val="nil"/>
+            </w:tcBorders>
+            <w:tcMar>
+              <w:top w:w="100.0" w:type="dxa"/>
+              <w:left w:w="100.0" w:type="dxa"/>
+              <w:bottom w:w="100.0" w:type="dxa"/>
+              <w:right w:w="100.0" w:type="dxa"/>
+            </w:tcMar>
+            <w:vAlign w:val="top"/>
+          </w:tcPr>
+          <w:p>
+            <w:pPr>
+              <w:rPr>
+                <w:b w:val="1"/>
+                <w:bCs w:val="1"/>
+                <w:sz w:val="26"/>
+                <w:szCs w:val="26"/>
+              </w:rPr>
+            </w:pPr>
+            <w:r>
+              <w:rPr>
+                <w:b w:val="1"/>
+                <w:bCs w:val="1"/>
+                <w:sz w:val="26"/>
+                <w:szCs w:val="26"/>
+                <w:rtl w:val="0"/>
+              </w:rPr>
+              <w:t xml:space="preserve">Main entrance, especially E3/E4, living area</w:t>
+            </w:r>
+          </w:p>
+        </w:tc>
+      </w:tr>
+      <w:tr>
+        <w:trPr>
+          <w:cantSplit w:val="0"/>
+          <w:trHeight w:val="500" w:hRule="atLeast"/>
+          <w:tblHeader w:val="0"/>
+        </w:trPr>
+        <w:tc>
+          <w:tcPr>
+            <w:tcBorders>
+              <w:top w:color="000000" w:space="0" w:sz="0" w:val="nil"/>
+              <w:left w:color="000000" w:space="0" w:sz="0" w:val="nil"/>
+              <w:bottom w:color="000000" w:space="0" w:sz="0" w:val="nil"/>
+              <w:right w:color="000000" w:space="0" w:sz="0" w:val="nil"/>
+            </w:tcBorders>
+            <w:tcMar>
+              <w:top w:w="100.0" w:type="dxa"/>
+              <w:left w:w="100.0" w:type="dxa"/>
+              <w:bottom w:w="100.0" w:type="dxa"/>
+              <w:right w:w="100.0" w:type="dxa"/>
+            </w:tcMar>
+            <w:vAlign w:val="top"/>
+          </w:tcPr>
+          <w:p>
+            <w:pPr>
+              <w:rPr>
+                <w:b w:val="1"/>
+                <w:bCs w:val="1"/>
+                <w:sz w:val="26"/>
+                <w:szCs w:val="26"/>
+              </w:rPr>
+            </w:pPr>
+            <w:r>
+              <w:rPr>
+                <w:b w:val="1"/>
+                <w:bCs w:val="1"/>
+                <w:sz w:val="26"/>
+                <w:szCs w:val="26"/>
+                <w:rtl w:val="0"/>
+              </w:rPr>
+              <w:t xml:space="preserve">ESE</w:t>
+            </w:r>
+          </w:p>
+        </w:tc>
+        <w:tc>
+          <w:tcPr>
+            <w:tcBorders>
+              <w:top w:color="000000" w:space="0" w:sz="0" w:val="nil"/>
+              <w:left w:color="000000" w:space="0" w:sz="0" w:val="nil"/>
+              <w:bottom w:color="000000" w:space="0" w:sz="0" w:val="nil"/>
+              <w:right w:color="000000" w:space="0" w:sz="0" w:val="nil"/>
+            </w:tcBorders>
+            <w:tcMar>
+              <w:top w:w="100.0" w:type="dxa"/>
+              <w:left w:w="100.0" w:type="dxa"/>
+              <w:bottom w:w="100.0" w:type="dxa"/>
+              <w:right w:w="100.0" w:type="dxa"/>
+            </w:tcMar>
+            <w:vAlign w:val="top"/>
+          </w:tcPr>
+          <w:p>
+            <w:pPr>
+              <w:rPr>
+                <w:b w:val="1"/>
+                <w:bCs w:val="1"/>
+                <w:sz w:val="26"/>
+                <w:szCs w:val="26"/>
+              </w:rPr>
+            </w:pPr>
+            <w:r>
+              <w:rPr>
+                <w:b w:val="1"/>
+                <w:bCs w:val="1"/>
+                <w:sz w:val="26"/>
+                <w:szCs w:val="26"/>
+                <w:rtl w:val="0"/>
+              </w:rPr>
+              <w:t xml:space="preserve">Electronics, inverter, electrical equipment</w:t>
+            </w:r>
+          </w:p>
+        </w:tc>
+      </w:tr>
+      <w:tr>
+        <w:trPr>
+          <w:cantSplit w:val="0"/>
+          <w:trHeight w:val="500" w:hRule="atLeast"/>
+          <w:tblHeader w:val="0"/>
+        </w:trPr>
+        <w:tc>
+          <w:tcPr>
+            <w:tcBorders>
+              <w:top w:color="000000" w:space="0" w:sz="0" w:val="nil"/>
+              <w:left w:color="000000" w:space="0" w:sz="0" w:val="nil"/>
+              <w:bottom w:color="000000" w:space="0" w:sz="0" w:val="nil"/>
+              <w:right w:color="000000" w:space="0" w:sz="0" w:val="nil"/>
+            </w:tcBorders>
+            <w:tcMar>
+              <w:top w:w="100.0" w:type="dxa"/>
+              <w:left w:w="100.0" w:type="dxa"/>
+              <w:bottom w:w="100.0" w:type="dxa"/>
+              <w:right w:w="100.0" w:type="dxa"/>
+            </w:tcMar>
+            <w:vAlign w:val="top"/>
+          </w:tcPr>
+          <w:p>
+            <w:pPr>
+              <w:rPr>
+                <w:b w:val="1"/>
+                <w:bCs w:val="1"/>
+                <w:sz w:val="26"/>
+                <w:szCs w:val="26"/>
+              </w:rPr>
+            </w:pPr>
+            <w:r>
+              <w:rPr>
+                <w:b w:val="1"/>
+                <w:bCs w:val="1"/>
+                <w:sz w:val="26"/>
+                <w:szCs w:val="26"/>
+                <w:rtl w:val="0"/>
+              </w:rPr>
+              <w:t xml:space="preserve">SE (South-East)</w:t>
+            </w:r>
+          </w:p>
+        </w:tc>
+        <w:tc>
+          <w:tcPr>
+            <w:tcBorders>
+              <w:top w:color="000000" w:space="0" w:sz="0" w:val="nil"/>
+              <w:left w:color="000000" w:space="0" w:sz="0" w:val="nil"/>
+              <w:bottom w:color="000000" w:space="0" w:sz="0" w:val="nil"/>
+              <w:right w:color="000000" w:space="0" w:sz="0" w:val="nil"/>
+            </w:tcBorders>
+            <w:tcMar>
+              <w:top w:w="100.0" w:type="dxa"/>
+              <w:left w:w="100.0" w:type="dxa"/>
+              <w:bottom w:w="100.0" w:type="dxa"/>
+              <w:right w:w="100.0" w:type="dxa"/>
+            </w:tcMar>
+            <w:vAlign w:val="top"/>
+          </w:tcPr>
+          <w:p>
+            <w:pPr>
+              <w:rPr>
+                <w:b w:val="1"/>
+                <w:bCs w:val="1"/>
+                <w:sz w:val="26"/>
+                <w:szCs w:val="26"/>
+              </w:rPr>
+            </w:pPr>
+            <w:r>
+              <w:rPr>
+                <w:b w:val="1"/>
+                <w:bCs w:val="1"/>
+                <w:sz w:val="26"/>
+                <w:szCs w:val="26"/>
+                <w:rtl w:val="0"/>
+              </w:rPr>
+              <w:t xml:space="preserve">Kitchen, cooking and fire-related activities</w:t>
+            </w:r>
+          </w:p>
+        </w:tc>
+      </w:tr>
+      <w:tr>
+        <w:trPr>
+          <w:cantSplit w:val="0"/>
+          <w:trHeight w:val="500" w:hRule="atLeast"/>
+          <w:tblHeader w:val="0"/>
+        </w:trPr>
+        <w:tc>
+          <w:tcPr>
+            <w:tcBorders>
+              <w:top w:color="000000" w:space="0" w:sz="0" w:val="nil"/>
+              <w:left w:color="000000" w:space="0" w:sz="0" w:val="nil"/>
+              <w:bottom w:color="000000" w:space="0" w:sz="0" w:val="nil"/>
+              <w:right w:color="000000" w:space="0" w:sz="0" w:val="nil"/>
+            </w:tcBorders>
+            <w:tcMar>
+              <w:top w:w="100.0" w:type="dxa"/>
+              <w:left w:w="100.0" w:type="dxa"/>
+              <w:bottom w:w="100.0" w:type="dxa"/>
+              <w:right w:w="100.0" w:type="dxa"/>
+            </w:tcMar>
+            <w:vAlign w:val="top"/>
+          </w:tcPr>
+          <w:p>
+            <w:pPr>
+              <w:rPr>
+                <w:b w:val="1"/>
+                <w:bCs w:val="1"/>
+                <w:sz w:val="26"/>
+                <w:szCs w:val="26"/>
+              </w:rPr>
+            </w:pPr>
+            <w:r>
+              <w:rPr>
+                <w:b w:val="1"/>
+                <w:bCs w:val="1"/>
+                <w:sz w:val="26"/>
+                <w:szCs w:val="26"/>
+                <w:rtl w:val="0"/>
+              </w:rPr>
+              <w:t xml:space="preserve">SSE</w:t>
+            </w:r>
+          </w:p>
+        </w:tc>
+        <w:tc>
+          <w:tcPr>
+            <w:tcBorders>
+              <w:top w:color="000000" w:space="0" w:sz="0" w:val="nil"/>
+              <w:left w:color="000000" w:space="0" w:sz="0" w:val="nil"/>
+              <w:bottom w:color="000000" w:space="0" w:sz="0" w:val="nil"/>
+              <w:right w:color="000000" w:space="0" w:sz="0" w:val="nil"/>
+            </w:tcBorders>
+            <w:tcMar>
+              <w:top w:w="100.0" w:type="dxa"/>
+              <w:left w:w="100.0" w:type="dxa"/>
+              <w:bottom w:w="100.0" w:type="dxa"/>
+              <w:right w:w="100.0" w:type="dxa"/>
+            </w:tcMar>
+            <w:vAlign w:val="top"/>
+          </w:tcPr>
+          <w:p>
+            <w:pPr>
+              <w:rPr>
+                <w:b w:val="1"/>
+                <w:bCs w:val="1"/>
+                <w:sz w:val="26"/>
+                <w:szCs w:val="26"/>
+              </w:rPr>
+            </w:pPr>
+            <w:r>
+              <w:rPr>
+                <w:b w:val="1"/>
+                <w:bCs w:val="1"/>
+                <w:sz w:val="26"/>
+                <w:szCs w:val="26"/>
+                <w:rtl w:val="0"/>
+              </w:rPr>
+              <w:t xml:space="preserve">Gym, fitness, electrical equipment and physical activities</w:t>
+            </w:r>
+          </w:p>
+        </w:tc>
+      </w:tr>
+      <w:tr>
+        <w:trPr>
+          <w:cantSplit w:val="0"/>
+          <w:trHeight w:val="500" w:hRule="atLeast"/>
+          <w:tblHeader w:val="0"/>
+        </w:trPr>
+        <w:tc>
+          <w:tcPr>
+            <w:tcBorders>
+              <w:top w:color="000000" w:space="0" w:sz="0" w:val="nil"/>
+              <w:left w:color="000000" w:space="0" w:sz="0" w:val="nil"/>
+              <w:bottom w:color="000000" w:space="0" w:sz="0" w:val="nil"/>
+              <w:right w:color="000000" w:space="0" w:sz="0" w:val="nil"/>
+            </w:tcBorders>
+            <w:tcMar>
+              <w:top w:w="100.0" w:type="dxa"/>
+              <w:left w:w="100.0" w:type="dxa"/>
+              <w:bottom w:w="100.0" w:type="dxa"/>
+              <w:right w:w="100.0" w:type="dxa"/>
+            </w:tcMar>
+            <w:vAlign w:val="top"/>
+          </w:tcPr>
+          <w:p>
+            <w:pPr>
+              <w:rPr>
+                <w:b w:val="1"/>
+                <w:bCs w:val="1"/>
+                <w:sz w:val="26"/>
+                <w:szCs w:val="26"/>
+              </w:rPr>
+            </w:pPr>
+            <w:r>
+              <w:rPr>
+                <w:b w:val="1"/>
+                <w:bCs w:val="1"/>
+                <w:sz w:val="26"/>
+                <w:szCs w:val="26"/>
+                <w:rtl w:val="0"/>
+              </w:rPr>
+              <w:t xml:space="preserve">S (South)</w:t>
+            </w:r>
+          </w:p>
+        </w:tc>
+        <w:tc>
+          <w:tcPr>
+            <w:tcBorders>
+              <w:top w:color="000000" w:space="0" w:sz="0" w:val="nil"/>
+              <w:left w:color="000000" w:space="0" w:sz="0" w:val="nil"/>
+              <w:bottom w:color="000000" w:space="0" w:sz="0" w:val="nil"/>
+              <w:right w:color="000000" w:space="0" w:sz="0" w:val="nil"/>
+            </w:tcBorders>
+            <w:tcMar>
+              <w:top w:w="100.0" w:type="dxa"/>
+              <w:left w:w="100.0" w:type="dxa"/>
+              <w:bottom w:w="100.0" w:type="dxa"/>
+              <w:right w:w="100.0" w:type="dxa"/>
+            </w:tcMar>
+            <w:vAlign w:val="top"/>
+          </w:tcPr>
+          <w:p>
+            <w:pPr>
+              <w:rPr>
+                <w:b w:val="1"/>
+                <w:bCs w:val="1"/>
+                <w:sz w:val="26"/>
+                <w:szCs w:val="26"/>
+              </w:rPr>
+            </w:pPr>
+            <w:r>
+              <w:rPr>
+                <w:b w:val="1"/>
+                <w:bCs w:val="1"/>
+                <w:sz w:val="26"/>
+                <w:szCs w:val="26"/>
+                <w:rtl w:val="0"/>
+              </w:rPr>
+              <w:t xml:space="preserve">Storage, work-related activities, heavy items</w:t>
+            </w:r>
+          </w:p>
+        </w:tc>
+      </w:tr>
+      <w:tr>
+        <w:trPr>
+          <w:cantSplit w:val="0"/>
+          <w:trHeight w:val="500" w:hRule="atLeast"/>
+          <w:tblHeader w:val="0"/>
+        </w:trPr>
+        <w:tc>
+          <w:tcPr>
+            <w:tcBorders>
+              <w:top w:color="000000" w:space="0" w:sz="0" w:val="nil"/>
+              <w:left w:color="000000" w:space="0" w:sz="0" w:val="nil"/>
+              <w:bottom w:color="000000" w:space="0" w:sz="0" w:val="nil"/>
+              <w:right w:color="000000" w:space="0" w:sz="0" w:val="nil"/>
+            </w:tcBorders>
+            <w:tcMar>
+              <w:top w:w="100.0" w:type="dxa"/>
+              <w:left w:w="100.0" w:type="dxa"/>
+              <w:bottom w:w="100.0" w:type="dxa"/>
+              <w:right w:w="100.0" w:type="dxa"/>
+            </w:tcMar>
+            <w:vAlign w:val="top"/>
+          </w:tcPr>
+          <w:p>
+            <w:pPr>
+              <w:rPr>
+                <w:b w:val="1"/>
+                <w:bCs w:val="1"/>
+                <w:sz w:val="26"/>
+                <w:szCs w:val="26"/>
+              </w:rPr>
+            </w:pPr>
+            <w:r>
+              <w:rPr>
+                <w:b w:val="1"/>
+                <w:bCs w:val="1"/>
+                <w:sz w:val="26"/>
+                <w:szCs w:val="26"/>
+                <w:rtl w:val="0"/>
+              </w:rPr>
+              <w:t xml:space="preserve">SSW</w:t>
+            </w:r>
+          </w:p>
+        </w:tc>
+        <w:tc>
+          <w:tcPr>
+            <w:tcBorders>
+              <w:top w:color="000000" w:space="0" w:sz="0" w:val="nil"/>
+              <w:left w:color="000000" w:space="0" w:sz="0" w:val="nil"/>
+              <w:bottom w:color="000000" w:space="0" w:sz="0" w:val="nil"/>
+              <w:right w:color="000000" w:space="0" w:sz="0" w:val="nil"/>
+            </w:tcBorders>
+            <w:tcMar>
+              <w:top w:w="100.0" w:type="dxa"/>
+              <w:left w:w="100.0" w:type="dxa"/>
+              <w:bottom w:w="100.0" w:type="dxa"/>
+              <w:right w:w="100.0" w:type="dxa"/>
+            </w:tcMar>
+            <w:vAlign w:val="top"/>
+          </w:tcPr>
+          <w:p>
+            <w:pPr>
+              <w:rPr>
+                <w:b w:val="1"/>
+                <w:bCs w:val="1"/>
+                <w:sz w:val="26"/>
+                <w:szCs w:val="26"/>
+              </w:rPr>
+            </w:pPr>
+            <w:r>
+              <w:rPr>
+                <w:b w:val="1"/>
+                <w:bCs w:val="1"/>
+                <w:sz w:val="26"/>
+                <w:szCs w:val="26"/>
+                <w:rtl w:val="0"/>
+              </w:rPr>
+              <w:t xml:space="preserve">Children's bedroom, support and stability</w:t>
+            </w:r>
+          </w:p>
+        </w:tc>
+      </w:tr>
+      <w:tr>
+        <w:trPr>
+          <w:cantSplit w:val="0"/>
+          <w:trHeight w:val="500" w:hRule="atLeast"/>
+          <w:tblHeader w:val="0"/>
+        </w:trPr>
+        <w:tc>
+          <w:tcPr>
+            <w:tcBorders>
+              <w:top w:color="000000" w:space="0" w:sz="0" w:val="nil"/>
+              <w:left w:color="000000" w:space="0" w:sz="0" w:val="nil"/>
+              <w:bottom w:color="000000" w:space="0" w:sz="0" w:val="nil"/>
+              <w:right w:color="000000" w:space="0" w:sz="0" w:val="nil"/>
+            </w:tcBorders>
+            <w:tcMar>
+              <w:top w:w="100.0" w:type="dxa"/>
+              <w:left w:w="100.0" w:type="dxa"/>
+              <w:bottom w:w="100.0" w:type="dxa"/>
+              <w:right w:w="100.0" w:type="dxa"/>
+            </w:tcMar>
+            <w:vAlign w:val="top"/>
+          </w:tcPr>
+          <w:p>
+            <w:pPr>
+              <w:rPr>
+                <w:b w:val="1"/>
+                <w:bCs w:val="1"/>
+                <w:sz w:val="26"/>
+                <w:szCs w:val="26"/>
+              </w:rPr>
+            </w:pPr>
+            <w:r>
+              <w:rPr>
+                <w:b w:val="1"/>
+                <w:bCs w:val="1"/>
+                <w:sz w:val="26"/>
+                <w:szCs w:val="26"/>
+                <w:rtl w:val="0"/>
+              </w:rPr>
+              <w:t xml:space="preserve">SW (South-West)</w:t>
+            </w:r>
+          </w:p>
+        </w:tc>
+        <w:tc>
+          <w:tcPr>
+            <w:tcBorders>
+              <w:top w:color="000000" w:space="0" w:sz="0" w:val="nil"/>
+              <w:left w:color="000000" w:space="0" w:sz="0" w:val="nil"/>
+              <w:bottom w:color="000000" w:space="0" w:sz="0" w:val="nil"/>
+              <w:right w:color="000000" w:space="0" w:sz="0" w:val="nil"/>
+            </w:tcBorders>
+            <w:tcMar>
+              <w:top w:w="100.0" w:type="dxa"/>
+              <w:left w:w="100.0" w:type="dxa"/>
+              <w:bottom w:w="100.0" w:type="dxa"/>
+              <w:right w:w="100.0" w:type="dxa"/>
+            </w:tcMar>
+            <w:vAlign w:val="top"/>
+          </w:tcPr>
+          <w:p>
+            <w:pPr>
+              <w:rPr>
+                <w:b w:val="1"/>
+                <w:bCs w:val="1"/>
+                <w:sz w:val="26"/>
+                <w:szCs w:val="26"/>
+              </w:rPr>
+            </w:pPr>
+            <w:r>
+              <w:rPr>
+                <w:b w:val="1"/>
+                <w:bCs w:val="1"/>
+                <w:sz w:val="26"/>
+                <w:szCs w:val="26"/>
+                <w:rtl w:val="0"/>
+              </w:rPr>
+              <w:t xml:space="preserve">Master bedroom, stability, authority and control</w:t>
+            </w:r>
+          </w:p>
+        </w:tc>
+      </w:tr>
+      <w:tr>
+        <w:trPr>
+          <w:cantSplit w:val="0"/>
+          <w:trHeight w:val="500" w:hRule="atLeast"/>
+          <w:tblHeader w:val="0"/>
+        </w:trPr>
+        <w:tc>
+          <w:tcPr>
+            <w:tcBorders>
+              <w:top w:color="000000" w:space="0" w:sz="0" w:val="nil"/>
+              <w:left w:color="000000" w:space="0" w:sz="0" w:val="nil"/>
+              <w:bottom w:color="000000" w:space="0" w:sz="0" w:val="nil"/>
+              <w:right w:color="000000" w:space="0" w:sz="0" w:val="nil"/>
+            </w:tcBorders>
+            <w:tcMar>
+              <w:top w:w="100.0" w:type="dxa"/>
+              <w:left w:w="100.0" w:type="dxa"/>
+              <w:bottom w:w="100.0" w:type="dxa"/>
+              <w:right w:w="100.0" w:type="dxa"/>
+            </w:tcMar>
+            <w:vAlign w:val="top"/>
+          </w:tcPr>
+          <w:p>
+            <w:pPr>
+              <w:rPr>
+                <w:b w:val="1"/>
+                <w:bCs w:val="1"/>
+                <w:sz w:val="26"/>
+                <w:szCs w:val="26"/>
+              </w:rPr>
+            </w:pPr>
+            <w:r>
+              <w:rPr>
+                <w:b w:val="1"/>
+                <w:bCs w:val="1"/>
+                <w:sz w:val="26"/>
+                <w:szCs w:val="26"/>
+                <w:rtl w:val="0"/>
+              </w:rPr>
+              <w:t xml:space="preserve">WSW</w:t>
+            </w:r>
+          </w:p>
+        </w:tc>
+        <w:tc>
+          <w:tcPr>
+            <w:tcBorders>
+              <w:top w:color="000000" w:space="0" w:sz="0" w:val="nil"/>
+              <w:left w:color="000000" w:space="0" w:sz="0" w:val="nil"/>
+              <w:bottom w:color="000000" w:space="0" w:sz="0" w:val="nil"/>
+              <w:right w:color="000000" w:space="0" w:sz="0" w:val="nil"/>
+            </w:tcBorders>
+            <w:tcMar>
+              <w:top w:w="100.0" w:type="dxa"/>
+              <w:left w:w="100.0" w:type="dxa"/>
+              <w:bottom w:w="100.0" w:type="dxa"/>
+              <w:right w:w="100.0" w:type="dxa"/>
+            </w:tcMar>
+            <w:vAlign w:val="top"/>
+          </w:tcPr>
+          <w:p>
+            <w:pPr>
+              <w:rPr>
+                <w:b w:val="1"/>
+                <w:bCs w:val="1"/>
+                <w:sz w:val="26"/>
+                <w:szCs w:val="26"/>
+              </w:rPr>
+            </w:pPr>
+            <w:r>
+              <w:rPr>
+                <w:b w:val="1"/>
+                <w:bCs w:val="1"/>
+                <w:sz w:val="26"/>
+                <w:szCs w:val="26"/>
+                <w:rtl w:val="0"/>
+              </w:rPr>
+              <w:t xml:space="preserve">Grain storage, stability, cash locker, study and children's study</w:t>
+            </w:r>
+          </w:p>
+        </w:tc>
+      </w:tr>
+      <w:tr>
+        <w:trPr>
+          <w:cantSplit w:val="0"/>
+          <w:trHeight w:val="500" w:hRule="atLeast"/>
+          <w:tblHeader w:val="0"/>
+        </w:trPr>
+        <w:tc>
+          <w:tcPr>
+            <w:tcBorders>
+              <w:top w:color="000000" w:space="0" w:sz="0" w:val="nil"/>
+              <w:left w:color="000000" w:space="0" w:sz="0" w:val="nil"/>
+              <w:bottom w:color="000000" w:space="0" w:sz="0" w:val="nil"/>
+              <w:right w:color="000000" w:space="0" w:sz="0" w:val="nil"/>
+            </w:tcBorders>
+            <w:tcMar>
+              <w:top w:w="100.0" w:type="dxa"/>
+              <w:left w:w="100.0" w:type="dxa"/>
+              <w:bottom w:w="100.0" w:type="dxa"/>
+              <w:right w:w="100.0" w:type="dxa"/>
+            </w:tcMar>
+            <w:vAlign w:val="top"/>
+          </w:tcPr>
+          <w:p>
+            <w:pPr>
+              <w:rPr>
+                <w:b w:val="1"/>
+                <w:bCs w:val="1"/>
+                <w:sz w:val="26"/>
+                <w:szCs w:val="26"/>
+              </w:rPr>
+            </w:pPr>
+            <w:r>
+              <w:rPr>
+                <w:b w:val="1"/>
+                <w:bCs w:val="1"/>
+                <w:sz w:val="26"/>
+                <w:szCs w:val="26"/>
+                <w:rtl w:val="0"/>
+              </w:rPr>
+              <w:t xml:space="preserve">W (West)</w:t>
+            </w:r>
+          </w:p>
+        </w:tc>
+        <w:tc>
+          <w:tcPr>
+            <w:tcBorders>
+              <w:top w:color="000000" w:space="0" w:sz="0" w:val="nil"/>
+              <w:left w:color="000000" w:space="0" w:sz="0" w:val="nil"/>
+              <w:bottom w:color="000000" w:space="0" w:sz="0" w:val="nil"/>
+              <w:right w:color="000000" w:space="0" w:sz="0" w:val="nil"/>
+            </w:tcBorders>
+            <w:tcMar>
+              <w:top w:w="100.0" w:type="dxa"/>
+              <w:left w:w="100.0" w:type="dxa"/>
+              <w:bottom w:w="100.0" w:type="dxa"/>
+              <w:right w:w="100.0" w:type="dxa"/>
+            </w:tcMar>
+            <w:vAlign w:val="top"/>
+          </w:tcPr>
+          <w:p>
+            <w:pPr>
+              <w:rPr>
+                <w:b w:val="1"/>
+                <w:bCs w:val="1"/>
+                <w:sz w:val="26"/>
+                <w:szCs w:val="26"/>
+              </w:rPr>
+            </w:pPr>
+            <w:r>
+              <w:rPr>
+                <w:b w:val="1"/>
+                <w:bCs w:val="1"/>
+                <w:sz w:val="26"/>
+                <w:szCs w:val="26"/>
+                <w:rtl w:val="0"/>
+              </w:rPr>
+              <w:t xml:space="preserve">Dining area, food-related activities</w:t>
+            </w:r>
+          </w:p>
+        </w:tc>
+      </w:tr>
+      <w:tr>
+        <w:trPr>
+          <w:cantSplit w:val="0"/>
+          <w:trHeight w:val="500" w:hRule="atLeast"/>
+          <w:tblHeader w:val="0"/>
+        </w:trPr>
+        <w:tc>
+          <w:tcPr>
+            <w:tcBorders>
+              <w:top w:color="000000" w:space="0" w:sz="0" w:val="nil"/>
+              <w:left w:color="000000" w:space="0" w:sz="0" w:val="nil"/>
+              <w:bottom w:color="000000" w:space="0" w:sz="0" w:val="nil"/>
+              <w:right w:color="000000" w:space="0" w:sz="0" w:val="nil"/>
+            </w:tcBorders>
+            <w:tcMar>
+              <w:top w:w="100.0" w:type="dxa"/>
+              <w:left w:w="100.0" w:type="dxa"/>
+              <w:bottom w:w="100.0" w:type="dxa"/>
+              <w:right w:w="100.0" w:type="dxa"/>
+            </w:tcMar>
+            <w:vAlign w:val="top"/>
+          </w:tcPr>
+          <w:p>
+            <w:pPr>
+              <w:rPr>
+                <w:b w:val="1"/>
+                <w:bCs w:val="1"/>
+                <w:sz w:val="26"/>
+                <w:szCs w:val="26"/>
+              </w:rPr>
+            </w:pPr>
+            <w:r>
+              <w:rPr>
+                <w:b w:val="1"/>
+                <w:bCs w:val="1"/>
+                <w:sz w:val="26"/>
+                <w:szCs w:val="26"/>
+                <w:rtl w:val="0"/>
+              </w:rPr>
+              <w:t xml:space="preserve">WNW</w:t>
+            </w:r>
+          </w:p>
+        </w:tc>
+        <w:tc>
+          <w:tcPr>
+            <w:tcBorders>
+              <w:top w:color="000000" w:space="0" w:sz="0" w:val="nil"/>
+              <w:left w:color="000000" w:space="0" w:sz="0" w:val="nil"/>
+              <w:bottom w:color="000000" w:space="0" w:sz="0" w:val="nil"/>
+              <w:right w:color="000000" w:space="0" w:sz="0" w:val="nil"/>
+            </w:tcBorders>
+            <w:tcMar>
+              <w:top w:w="100.0" w:type="dxa"/>
+              <w:left w:w="100.0" w:type="dxa"/>
+              <w:bottom w:w="100.0" w:type="dxa"/>
+              <w:right w:w="100.0" w:type="dxa"/>
+            </w:tcMar>
+            <w:vAlign w:val="top"/>
+          </w:tcPr>
+          <w:p>
+            <w:pPr>
+              <w:rPr>
+                <w:b w:val="1"/>
+                <w:bCs w:val="1"/>
+                <w:sz w:val="26"/>
+                <w:szCs w:val="26"/>
+              </w:rPr>
+            </w:pPr>
+            <w:r>
+              <w:rPr>
+                <w:b w:val="1"/>
+                <w:bCs w:val="1"/>
+                <w:sz w:val="26"/>
+                <w:szCs w:val="26"/>
+                <w:rtl w:val="0"/>
+              </w:rPr>
+              <w:t xml:space="preserve">Guest room, temporary stay and movement</w:t>
+            </w:r>
+          </w:p>
+        </w:tc>
+      </w:tr>
+      <w:tr>
+        <w:trPr>
+          <w:cantSplit w:val="0"/>
+          <w:trHeight w:val="500" w:hRule="atLeast"/>
+          <w:tblHeader w:val="0"/>
+        </w:trPr>
+        <w:tc>
+          <w:tcPr>
+            <w:tcBorders>
+              <w:top w:color="000000" w:space="0" w:sz="0" w:val="nil"/>
+              <w:left w:color="000000" w:space="0" w:sz="0" w:val="nil"/>
+              <w:bottom w:color="000000" w:space="0" w:sz="0" w:val="nil"/>
+              <w:right w:color="000000" w:space="0" w:sz="0" w:val="nil"/>
+            </w:tcBorders>
+            <w:tcMar>
+              <w:top w:w="100.0" w:type="dxa"/>
+              <w:left w:w="100.0" w:type="dxa"/>
+              <w:bottom w:w="100.0" w:type="dxa"/>
+              <w:right w:w="100.0" w:type="dxa"/>
+            </w:tcMar>
+            <w:vAlign w:val="top"/>
+          </w:tcPr>
+          <w:p>
+            <w:pPr>
+              <w:rPr>
+                <w:b w:val="1"/>
+                <w:bCs w:val="1"/>
+                <w:sz w:val="26"/>
+                <w:szCs w:val="26"/>
+              </w:rPr>
+            </w:pPr>
+            <w:r>
+              <w:rPr>
+                <w:b w:val="1"/>
+                <w:bCs w:val="1"/>
+                <w:sz w:val="26"/>
+                <w:szCs w:val="26"/>
+                <w:rtl w:val="0"/>
+              </w:rPr>
+              <w:t xml:space="preserve">NW (North-West)</w:t>
+            </w:r>
+          </w:p>
+        </w:tc>
+        <w:tc>
+          <w:tcPr>
+            <w:tcBorders>
+              <w:top w:color="000000" w:space="0" w:sz="0" w:val="nil"/>
+              <w:left w:color="000000" w:space="0" w:sz="0" w:val="nil"/>
+              <w:bottom w:color="000000" w:space="0" w:sz="0" w:val="nil"/>
+              <w:right w:color="000000" w:space="0" w:sz="0" w:val="nil"/>
+            </w:tcBorders>
+            <w:tcMar>
+              <w:top w:w="100.0" w:type="dxa"/>
+              <w:left w:w="100.0" w:type="dxa"/>
+              <w:bottom w:w="100.0" w:type="dxa"/>
+              <w:right w:w="100.0" w:type="dxa"/>
+            </w:tcMar>
+            <w:vAlign w:val="top"/>
+          </w:tcPr>
+          <w:p>
+            <w:pPr>
+              <w:rPr>
+                <w:b w:val="1"/>
+                <w:bCs w:val="1"/>
+                <w:sz w:val="26"/>
+                <w:szCs w:val="26"/>
+              </w:rPr>
+            </w:pPr>
+            <w:r>
+              <w:rPr>
+                <w:b w:val="1"/>
+                <w:bCs w:val="1"/>
+                <w:sz w:val="26"/>
+                <w:szCs w:val="26"/>
+                <w:rtl w:val="0"/>
+              </w:rPr>
+              <w:t xml:space="preserve">Guest bedroom, air circulation and movement</w:t>
+            </w:r>
+          </w:p>
+        </w:tc>
+      </w:tr>
+      <w:tr>
+        <w:trPr>
+          <w:cantSplit w:val="0"/>
+          <w:trHeight w:val="500" w:hRule="atLeast"/>
+          <w:tblHeader w:val="0"/>
+        </w:trPr>
+        <w:tc>
+          <w:tcPr>
+            <w:tcBorders>
+              <w:top w:color="000000" w:space="0" w:sz="0" w:val="nil"/>
+              <w:left w:color="000000" w:space="0" w:sz="0" w:val="nil"/>
+              <w:bottom w:color="000000" w:space="0" w:sz="0" w:val="nil"/>
+              <w:right w:color="000000" w:space="0" w:sz="0" w:val="nil"/>
+            </w:tcBorders>
+            <w:tcMar>
+              <w:top w:w="100.0" w:type="dxa"/>
+              <w:left w:w="100.0" w:type="dxa"/>
+              <w:bottom w:w="100.0" w:type="dxa"/>
+              <w:right w:w="100.0" w:type="dxa"/>
+            </w:tcMar>
+            <w:vAlign w:val="top"/>
+          </w:tcPr>
+          <w:p>
+            <w:pPr>
+              <w:rPr>
+                <w:b w:val="1"/>
+                <w:bCs w:val="1"/>
+                <w:sz w:val="26"/>
+                <w:szCs w:val="26"/>
+              </w:rPr>
+            </w:pPr>
+            <w:r>
+              <w:rPr>
+                <w:b w:val="1"/>
+                <w:bCs w:val="1"/>
+                <w:sz w:val="26"/>
+                <w:szCs w:val="26"/>
+                <w:rtl w:val="0"/>
+              </w:rPr>
+              <w:t xml:space="preserve">NNW</w:t>
+            </w:r>
+          </w:p>
+        </w:tc>
+        <w:tc>
+          <w:tcPr>
+            <w:tcBorders>
+              <w:top w:color="000000" w:space="0" w:sz="0" w:val="nil"/>
+              <w:left w:color="000000" w:space="0" w:sz="0" w:val="nil"/>
+              <w:bottom w:color="000000" w:space="0" w:sz="0" w:val="nil"/>
+              <w:right w:color="000000" w:space="0" w:sz="0" w:val="nil"/>
+            </w:tcBorders>
+            <w:tcMar>
+              <w:top w:w="100.0" w:type="dxa"/>
+              <w:left w:w="100.0" w:type="dxa"/>
+              <w:bottom w:w="100.0" w:type="dxa"/>
+              <w:right w:w="100.0" w:type="dxa"/>
+            </w:tcMar>
+            <w:vAlign w:val="top"/>
+          </w:tcPr>
+          <w:p>
+            <w:pPr>
+              <w:rPr>
+                <w:b w:val="1"/>
+                <w:bCs w:val="1"/>
+                <w:sz w:val="26"/>
+                <w:szCs w:val="26"/>
+              </w:rPr>
+            </w:pPr>
+            <w:r>
+              <w:rPr>
+                <w:b w:val="1"/>
+                <w:bCs w:val="1"/>
+                <w:sz w:val="26"/>
+                <w:szCs w:val="26"/>
+                <w:rtl w:val="0"/>
+              </w:rPr>
+              <w:t xml:space="preserve">Toilet, utility area and activities involving movement/disposal</w:t>
+            </w:r>
+          </w:p>
+        </w:tc>
+      </w:tr>
+    </w:tbl>
+    <w:p>
+      <w:pPr>
+        <w:pStyle w:val="Heading2"/>
+        <w:keepNext w:val="0"/>
+        <w:keepLines w:val="0"/>
+        <w:spacing w:after="80" w:lineRule="auto"/>
+        <w:rPr>
+          <w:b w:val="1"/>
+          <w:bCs w:val="1"/>
+          <w:sz w:val="34"/>
+          <w:szCs w:val="34"/>
+        </w:rPr>
+      </w:pPr>
+      <w:bookmarkStart w:colFirst="0" w:colLast="0" w:name="_c8xjp799z9it" w:id="2"/>
+      <w:bookmarkEnd w:id="2"/>
+      <w:r>
+        <w:rPr>
+          <w:b w:val="1"/>
+          <w:bCs w:val="1"/>
+          <w:sz w:val="34"/>
+          <w:szCs w:val="34"/>
+          <w:rtl w:val="0"/>
+        </w:rPr>
+        <w:t xml:space="preserve">Ideal House Layout</w:t>
+      </w:r>
+    </w:p>
+    <w:p>
+      <w:pPr>
+        <w:rPr/>
+      </w:pPr>
+      <w:r>
+        <w:rPr>
+          <w:b w:val="1"/>
+          <w:bCs w:val="1"/>
+          <w:sz w:val="26"/>
+          <w:szCs w:val="26"/>
+        </w:rPr>
+        <w:drawing>
+          <wp:inline distB="114300" distT="114300" distL="114300" distR="114300">
+            <wp:extent cx="4481513" cy="4556027"/>
+            <wp:effectExtent b="0" l="0" r="0" t="0"/>
+            <wp:docPr id="4" name="image4.png"/>
+            <a:graphic>
+              <a:graphicData uri="http://schemas.openxmlformats.org/drawingml/2006/picture">
+                <pic:pic>
+                  <pic:nvPicPr>
+                    <pic:cNvPr id="0" name="image4.png"/>
+                    <pic:cNvPicPr preferRelativeResize="0"/>
+                  </pic:nvPicPr>
+                  <pic:blipFill>
+                    <a:blip r:embed="rId12"/>
+                    <a:srcRect b="0" l="0" r="0" t="0"/>
+                    <a:stretch>
+                      <a:fillRect/>
+                    </a:stretch>
+                  </pic:blipFill>
+                  <pic:spPr>
+                    <a:xfrm>
+                      <a:off x="0" y="0"/>
+                      <a:ext cx="4481513" cy="4556027"/>
+                    </a:xfrm>
+                    <a:prstGeom prst="rect"/>
+                    <a:ln/>
+                  </pic:spPr>
+                </pic:pic>
+              </a:graphicData>
+            </a:graphic>
+          </wp:inline>
+        </w:drawing>
+      </w:r>
+      <w:r>
+        <w:rPr>
+          <w:rtl w:val="0"/>
+        </w:rPr>
+      </w:r>
+    </w:p>
+    <w:p>
+      <w:pPr>
+        <w:spacing w:after="240" w:before="240" w:lineRule="auto"/>
+        <w:rPr>
+          <w:b w:val="1"/>
+          <w:bCs w:val="1"/>
+          <w:sz w:val="26"/>
+          <w:szCs w:val="26"/>
+        </w:rPr>
+      </w:pPr>
+      <w:r>
+        <w:rPr>
+          <w:b w:val="1"/>
+          <w:bCs w:val="1"/>
+          <w:sz w:val="26"/>
+          <w:szCs w:val="26"/>
+          <w:rtl w:val="0"/>
+        </w:rPr>
+        <w:t xml:space="preserve">An ideal Vastu house should maintain a proper balance between the five elements — Earth, Water, Fire, Air and Space.</w:t>
+      </w:r>
+    </w:p>
+    <w:p>
+      <w:pPr>
+        <w:pStyle w:val="Heading3"/>
+        <w:keepNext w:val="0"/>
+        <w:keepLines w:val="0"/>
+        <w:spacing w:before="280" w:lineRule="auto"/>
+        <w:rPr>
+          <w:b w:val="1"/>
+          <w:bCs w:val="1"/>
+          <w:color w:val="000000"/>
+          <w:sz w:val="26"/>
+          <w:szCs w:val="26"/>
+        </w:rPr>
+      </w:pPr>
+      <w:bookmarkStart w:colFirst="0" w:colLast="0" w:name="_slm733i7zetj" w:id="3"/>
+      <w:bookmarkEnd w:id="3"/>
+      <w:r>
+        <w:rPr>
+          <w:b w:val="1"/>
+          <w:bCs w:val="1"/>
+          <w:color w:val="000000"/>
+          <w:sz w:val="26"/>
+          <w:szCs w:val="26"/>
+          <w:rtl w:val="0"/>
+        </w:rPr>
+        <w:t xml:space="preserve">Most Auspicious Locations</w:t>
+      </w:r>
+    </w:p>
+    <w:p>
+      <w:pPr>
+        <w:numPr>
+          <w:ilvl w:val="0"/>
+          <w:numId w:val="1"/>
+        </w:numPr>
+        <w:spacing w:after="0" w:afterAutospacing="0" w:before="240" w:lineRule="auto"/>
+        <w:ind w:left="720" w:hanging="360"/>
+        <w:rPr>
+          <w:b w:val="1"/>
+          <w:bCs w:val="1"/>
+          <w:sz w:val="26"/>
+          <w:szCs w:val="26"/>
+        </w:rPr>
+      </w:pPr>
+      <w:r>
+        <w:rPr>
+          <w:b w:val="1"/>
+          <w:bCs w:val="1"/>
+          <w:sz w:val="26"/>
+          <w:szCs w:val="26"/>
+          <w:rtl w:val="0"/>
+        </w:rPr>
+        <w:t xml:space="preserve">NE (North-East): Temple, water element and open space</w:t>
+      </w:r>
+    </w:p>
+    <w:p>
+      <w:pPr>
+        <w:numPr>
+          <w:ilvl w:val="0"/>
+          <w:numId w:val="1"/>
+        </w:numPr>
+        <w:spacing w:after="0" w:afterAutospacing="0" w:before="0" w:beforeAutospacing="0" w:lineRule="auto"/>
+        <w:ind w:left="720" w:hanging="360"/>
+        <w:rPr>
+          <w:b w:val="1"/>
+          <w:bCs w:val="1"/>
+          <w:sz w:val="26"/>
+          <w:szCs w:val="26"/>
+        </w:rPr>
+      </w:pPr>
+      <w:r>
+        <w:rPr>
+          <w:b w:val="1"/>
+          <w:bCs w:val="1"/>
+          <w:sz w:val="26"/>
+          <w:szCs w:val="26"/>
+          <w:rtl w:val="0"/>
+        </w:rPr>
+        <w:t xml:space="preserve">SE (South-East): Kitchen and fire-related activities</w:t>
+      </w:r>
+    </w:p>
+    <w:p>
+      <w:pPr>
+        <w:numPr>
+          <w:ilvl w:val="0"/>
+          <w:numId w:val="1"/>
+        </w:numPr>
+        <w:spacing w:after="0" w:afterAutospacing="0" w:before="0" w:beforeAutospacing="0" w:lineRule="auto"/>
+        <w:ind w:left="720" w:hanging="360"/>
+        <w:rPr>
+          <w:b w:val="1"/>
+          <w:bCs w:val="1"/>
+          <w:sz w:val="26"/>
+          <w:szCs w:val="26"/>
+        </w:rPr>
+      </w:pPr>
+      <w:r>
+        <w:rPr>
+          <w:b w:val="1"/>
+          <w:bCs w:val="1"/>
+          <w:sz w:val="26"/>
+          <w:szCs w:val="26"/>
+          <w:rtl w:val="0"/>
+        </w:rPr>
+        <w:t xml:space="preserve">SW (South-West): Master bedroom and heavy/stable areas</w:t>
+      </w:r>
+    </w:p>
+    <w:p>
+      <w:pPr>
+        <w:numPr>
+          <w:ilvl w:val="0"/>
+          <w:numId w:val="1"/>
+        </w:numPr>
+        <w:spacing w:after="0" w:afterAutospacing="0" w:before="0" w:beforeAutospacing="0" w:lineRule="auto"/>
+        <w:ind w:left="720" w:hanging="360"/>
+        <w:rPr>
+          <w:b w:val="1"/>
+          <w:bCs w:val="1"/>
+          <w:sz w:val="26"/>
+          <w:szCs w:val="26"/>
+        </w:rPr>
+      </w:pPr>
+      <w:r>
+        <w:rPr>
+          <w:b w:val="1"/>
+          <w:bCs w:val="1"/>
+          <w:sz w:val="26"/>
+          <w:szCs w:val="26"/>
+          <w:rtl w:val="0"/>
+        </w:rPr>
+        <w:t xml:space="preserve">N (North): Wealth, career and financial activities</w:t>
+      </w:r>
+    </w:p>
+    <w:p>
+      <w:pPr>
+        <w:numPr>
+          <w:ilvl w:val="0"/>
+          <w:numId w:val="1"/>
+        </w:numPr>
+        <w:spacing w:after="240" w:before="0" w:beforeAutospacing="0" w:lineRule="auto"/>
+        <w:ind w:left="720" w:hanging="360"/>
+        <w:rPr>
+          <w:b w:val="1"/>
+          <w:bCs w:val="1"/>
+          <w:sz w:val="26"/>
+          <w:szCs w:val="26"/>
+        </w:rPr>
+      </w:pPr>
+      <w:r>
+        <w:rPr>
+          <w:b w:val="1"/>
+          <w:bCs w:val="1"/>
+          <w:sz w:val="26"/>
+          <w:szCs w:val="26"/>
+          <w:rtl w:val="0"/>
+        </w:rPr>
+        <w:t xml:space="preserve">E (East): Main entrance, particularly E3/E4</w:t>
+      </w:r>
+    </w:p>
+    <w:p>
+      <w:pPr>
+        <w:pStyle w:val="Heading2"/>
+        <w:keepNext w:val="0"/>
+        <w:keepLines w:val="0"/>
+        <w:spacing w:after="80" w:lineRule="auto"/>
+        <w:rPr>
+          <w:b w:val="1"/>
+          <w:bCs w:val="1"/>
+          <w:sz w:val="34"/>
+          <w:szCs w:val="34"/>
+        </w:rPr>
+      </w:pPr>
+      <w:bookmarkStart w:colFirst="0" w:colLast="0" w:name="_yz7oehtbsg1h" w:id="4"/>
+      <w:bookmarkEnd w:id="4"/>
+      <w:r>
+        <w:rPr>
+          <w:b w:val="1"/>
+          <w:bCs w:val="1"/>
+          <w:sz w:val="34"/>
+          <w:szCs w:val="34"/>
+          <w:rtl w:val="0"/>
+        </w:rPr>
+        <w:t xml:space="preserve">Things to Avoid</w:t>
+      </w:r>
+    </w:p>
+    <w:p>
+      <w:pPr>
+        <w:numPr>
+          <w:ilvl w:val="0"/>
+          <w:numId w:val="2"/>
+        </w:numPr>
+        <w:spacing w:after="0" w:afterAutospacing="0" w:before="240" w:lineRule="auto"/>
+        <w:ind w:left="720" w:hanging="360"/>
+        <w:rPr>
+          <w:b w:val="1"/>
+          <w:bCs w:val="1"/>
+          <w:sz w:val="26"/>
+          <w:szCs w:val="26"/>
+        </w:rPr>
+      </w:pPr>
+      <w:r>
+        <w:rPr>
+          <w:b w:val="1"/>
+          <w:bCs w:val="1"/>
+          <w:sz w:val="26"/>
+          <w:szCs w:val="26"/>
+          <w:rtl w:val="0"/>
+        </w:rPr>
+        <w:t xml:space="preserve">Avoid a toilet in the NE (North-East).</w:t>
+      </w:r>
+    </w:p>
+    <w:p>
+      <w:pPr>
+        <w:numPr>
+          <w:ilvl w:val="0"/>
+          <w:numId w:val="2"/>
+        </w:numPr>
+        <w:spacing w:after="0" w:afterAutospacing="0" w:before="0" w:beforeAutospacing="0" w:lineRule="auto"/>
+        <w:ind w:left="720" w:hanging="360"/>
+        <w:rPr>
+          <w:b w:val="1"/>
+          <w:bCs w:val="1"/>
+          <w:sz w:val="26"/>
+          <w:szCs w:val="26"/>
+        </w:rPr>
+      </w:pPr>
+      <w:r>
+        <w:rPr>
+          <w:b w:val="1"/>
+          <w:bCs w:val="1"/>
+          <w:sz w:val="26"/>
+          <w:szCs w:val="26"/>
+          <w:rtl w:val="0"/>
+        </w:rPr>
+        <w:t xml:space="preserve">Avoid a kitchen in the SW (South-West).</w:t>
+      </w:r>
+    </w:p>
+    <w:p>
+      <w:pPr>
+        <w:numPr>
+          <w:ilvl w:val="0"/>
+          <w:numId w:val="2"/>
+        </w:numPr>
+        <w:spacing w:after="0" w:afterAutospacing="0" w:before="0" w:beforeAutospacing="0" w:lineRule="auto"/>
+        <w:ind w:left="720" w:hanging="360"/>
+        <w:rPr>
+          <w:b w:val="1"/>
+          <w:bCs w:val="1"/>
+          <w:sz w:val="26"/>
+          <w:szCs w:val="26"/>
+        </w:rPr>
+      </w:pPr>
+      <w:r>
+        <w:rPr>
+          <w:b w:val="1"/>
+          <w:bCs w:val="1"/>
+          <w:sz w:val="26"/>
+          <w:szCs w:val="26"/>
+          <w:rtl w:val="0"/>
+        </w:rPr>
+        <w:t xml:space="preserve">Avoid placing heavy objects or unnecessary structures in the Brahmasthan.</w:t>
+      </w:r>
+    </w:p>
+    <w:p>
+      <w:pPr>
+        <w:numPr>
+          <w:ilvl w:val="0"/>
+          <w:numId w:val="2"/>
+        </w:numPr>
+        <w:spacing w:after="0" w:afterAutospacing="0" w:before="0" w:beforeAutospacing="0" w:lineRule="auto"/>
+        <w:ind w:left="720" w:hanging="360"/>
+        <w:rPr>
+          <w:b w:val="1"/>
+          <w:bCs w:val="1"/>
+          <w:sz w:val="26"/>
+          <w:szCs w:val="26"/>
+        </w:rPr>
+      </w:pPr>
+      <w:r>
+        <w:rPr>
+          <w:b w:val="1"/>
+          <w:bCs w:val="1"/>
+          <w:sz w:val="26"/>
+          <w:szCs w:val="26"/>
+          <w:rtl w:val="0"/>
+        </w:rPr>
+        <w:t xml:space="preserve">Avoid an underground water tank in the SW (South-West).</w:t>
+      </w:r>
+    </w:p>
+    <w:p>
+      <w:pPr>
+        <w:numPr>
+          <w:ilvl w:val="0"/>
+          <w:numId w:val="2"/>
+        </w:numPr>
+        <w:spacing w:after="0" w:afterAutospacing="0" w:before="0" w:beforeAutospacing="0" w:lineRule="auto"/>
+        <w:ind w:left="720" w:hanging="360"/>
+        <w:rPr>
+          <w:b w:val="1"/>
+          <w:bCs w:val="1"/>
+          <w:sz w:val="26"/>
+          <w:szCs w:val="26"/>
+        </w:rPr>
+      </w:pPr>
+      <w:r>
+        <w:rPr>
+          <w:b w:val="1"/>
+          <w:bCs w:val="1"/>
+          <w:sz w:val="26"/>
+          <w:szCs w:val="26"/>
+          <w:rtl w:val="0"/>
+        </w:rPr>
+        <w:t xml:space="preserve">Avoid a staircase in the NE (North-East).</w:t>
+      </w:r>
+    </w:p>
+    <w:p>
+      <w:pPr>
+        <w:numPr>
+          <w:ilvl w:val="0"/>
+          <w:numId w:val="2"/>
+        </w:numPr>
+        <w:spacing w:after="0" w:afterAutospacing="0" w:before="0" w:beforeAutospacing="0" w:lineRule="auto"/>
+        <w:ind w:left="720" w:hanging="360"/>
+        <w:rPr>
+          <w:b w:val="1"/>
+          <w:bCs w:val="1"/>
+          <w:sz w:val="26"/>
+          <w:szCs w:val="26"/>
+        </w:rPr>
+      </w:pPr>
+      <w:r>
+        <w:rPr>
+          <w:b w:val="1"/>
+          <w:bCs w:val="1"/>
+          <w:sz w:val="26"/>
+          <w:szCs w:val="26"/>
+          <w:rtl w:val="0"/>
+        </w:rPr>
+        <w:t xml:space="preserve">Avoid excessive clutter and heavy storage in the NE.</w:t>
+      </w:r>
+    </w:p>
+    <w:p>
+      <w:pPr>
+        <w:numPr>
+          <w:ilvl w:val="0"/>
+          <w:numId w:val="2"/>
+        </w:numPr>
+        <w:spacing w:after="240" w:before="0" w:beforeAutospacing="0" w:lineRule="auto"/>
+        <w:ind w:left="720" w:hanging="360"/>
+        <w:rPr>
+          <w:b w:val="1"/>
+          <w:bCs w:val="1"/>
+          <w:sz w:val="26"/>
+          <w:szCs w:val="26"/>
+        </w:rPr>
+      </w:pPr>
+      <w:r>
+        <w:rPr>
+          <w:b w:val="1"/>
+          <w:bCs w:val="1"/>
+          <w:sz w:val="26"/>
+          <w:szCs w:val="26"/>
+          <w:rtl w:val="0"/>
+        </w:rPr>
+        <w:t xml:space="preserve">Keep the Brahmasthan as light, clean and open as possible.</w:t>
+      </w:r>
+    </w:p>
+    <w:p>
+      <w:pPr>
+        <w:rPr>
+          <w:b w:val="1"/>
+          <w:bCs w:val="1"/>
+          <w:sz w:val="26"/>
+          <w:szCs w:val="26"/>
+        </w:rPr>
+      </w:pPr>
+      <w:r>
+        <w:rPr>
+          <w:b w:val="1"/>
+          <w:bCs w:val="1"/>
+          <w:sz w:val="26"/>
+          <w:szCs w:val="26"/>
+        </w:rPr>
+        <w:drawing>
+          <wp:inline distB="114300" distT="114300" distL="114300" distR="114300">
+            <wp:extent cx="5300663" cy="4023925"/>
+            <wp:effectExtent b="0" l="0" r="0" t="0"/>
+            <wp:docPr descr="Important Vastu Tips For New Home 2022 - Rethinking The Future" id="3" name="image2.jpg"/>
+            <a:graphic>
+              <a:graphicData uri="http://schemas.openxmlformats.org/drawingml/2006/picture">
+                <pic:pic>
+                  <pic:nvPicPr>
+                    <pic:cNvPr descr="Important Vastu Tips For New Home 2022 - Rethinking The Future" id="0" name="image2.jpg"/>
+                    <pic:cNvPicPr preferRelativeResize="0"/>
+                  </pic:nvPicPr>
+                  <pic:blipFill>
+                    <a:blip r:embed="rId9"/>
+                    <a:srcRect b="0" l="0" r="0" t="0"/>
+                    <a:stretch>
+                      <a:fillRect/>
+                    </a:stretch>
+                  </pic:blipFill>
+                  <pic:spPr>
+                    <a:xfrm>
+                      <a:off x="0" y="0"/>
+                      <a:ext cx="5300663" cy="4023925"/>
+                    </a:xfrm>
+                    <a:prstGeom prst="rect"/>
+                    <a:ln/>
+                  </pic:spPr>
+                </pic:pic>
+              </a:graphicData>
+            </a:graphic>
+          </wp:inline>
+        </w:drawing>
+      </w:r>
+      <w:r>
+        <w:rPr>
+          <w:rtl w:val="0"/>
+        </w:rPr>
+      </w:r>
+    </w:p>
+    <w:p>
+      <w:pPr>
+        <w:ind w:hanging="900"/>
+        <w:rPr/>
       </w:pPr>
       <w:r>
         <w:rPr>

</xml_diff>

<commit_message>
Fix report client details and wrap room-wise remedies.
Show project name and description on separate lines, and keep long remedy text from breaking the analysis table in PDF and Word.
</commit_message>
<xml_diff>
--- a/app/services/templates/report_en.docx
+++ b/app/services/templates/report_en.docx
@@ -162,7 +162,13 @@
               <w:rPr>
                 <w:rtl w:val="0"/>
               </w:rPr>
-              <w:t xml:space="preserve">{{ client.name }}</w:t>
+              <w:t xml:space="preserve">{{ project.name }}</w:t>
+            </w:r>
+            <w:r>
+              <w:br/>
+            </w:r>
+            <w:r>
+              <w:t xml:space="preserve">{{ project.description }}</w:t>
             </w:r>
           </w:p>
         </w:tc>

</xml_diff>

<commit_message>
Left-align report table cells in PDF and Word templates.
Keep remedy line breaks without HTML indentation making cell text look centered.
</commit_message>
<xml_diff>
--- a/app/services/templates/report_en.docx
+++ b/app/services/templates/report_en.docx
@@ -122,6 +122,7 @@
             <w:pPr>
               <w:spacing w:after="60" w:lineRule="auto"/>
               <w:rPr/>
+              <w:jc w:val="left"/>
             </w:pPr>
             <w:r>
               <w:rPr>
@@ -157,6 +158,7 @@
             <w:pPr>
               <w:spacing w:after="60" w:lineRule="auto"/>
               <w:rPr/>
+              <w:jc w:val="left"/>
             </w:pPr>
             <w:r>
               <w:rPr>
@@ -198,6 +200,7 @@
             <w:pPr>
               <w:spacing w:after="60" w:lineRule="auto"/>
               <w:rPr/>
+              <w:jc w:val="left"/>
             </w:pPr>
             <w:r>
               <w:rPr>
@@ -233,6 +236,7 @@
             <w:pPr>
               <w:spacing w:after="60" w:lineRule="auto"/>
               <w:rPr/>
+              <w:jc w:val="left"/>
             </w:pPr>
             <w:r>
               <w:rPr>
@@ -268,6 +272,7 @@
             <w:pPr>
               <w:spacing w:after="60" w:lineRule="auto"/>
               <w:rPr/>
+              <w:jc w:val="left"/>
             </w:pPr>
             <w:r>
               <w:rPr>
@@ -303,6 +308,7 @@
             <w:pPr>
               <w:spacing w:after="60" w:lineRule="auto"/>
               <w:rPr/>
+              <w:jc w:val="left"/>
             </w:pPr>
             <w:r>
               <w:rPr>
@@ -338,6 +344,7 @@
             <w:pPr>
               <w:spacing w:after="60" w:lineRule="auto"/>
               <w:rPr/>
+              <w:jc w:val="left"/>
             </w:pPr>
             <w:r>
               <w:rPr>
@@ -373,6 +380,7 @@
             <w:pPr>
               <w:spacing w:after="60" w:lineRule="auto"/>
               <w:rPr/>
+              <w:jc w:val="left"/>
             </w:pPr>
             <w:r>
               <w:rPr>
@@ -408,6 +416,7 @@
             <w:pPr>
               <w:spacing w:after="60" w:lineRule="auto"/>
               <w:rPr/>
+              <w:jc w:val="left"/>
             </w:pPr>
             <w:r>
               <w:rPr>
@@ -443,6 +452,7 @@
             <w:pPr>
               <w:spacing w:after="60" w:lineRule="auto"/>
               <w:rPr/>
+              <w:jc w:val="left"/>
             </w:pPr>
             <w:r>
               <w:rPr>
@@ -687,6 +697,7 @@
               <w:rPr>
                 <w:color w:val="ffffff"/>
               </w:rPr>
+              <w:jc w:val="left"/>
             </w:pPr>
             <w:r>
               <w:rPr>
@@ -852,6 +863,7 @@
               <w:rPr>
                 <w:color w:val="ffffff"/>
               </w:rPr>
+              <w:jc w:val="left"/>
             </w:pPr>
             <w:r>
               <w:rPr>
@@ -864,6 +876,7 @@
           <w:p>
             <w:pPr>
               <w:rPr/>
+              <w:jc w:val="left"/>
             </w:pPr>
             <w:r>
               <w:rPr>
@@ -874,6 +887,7 @@
           <w:p>
             <w:pPr>
               <w:rPr/>
+              <w:jc w:val="left"/>
             </w:pPr>
             <w:r>
               <w:rPr>
@@ -1156,6 +1170,7 @@
             <w:pPr>
               <w:spacing w:after="80" w:lineRule="auto"/>
               <w:rPr/>
+              <w:jc w:val="left"/>
             </w:pPr>
             <w:r>
               <w:rPr>
@@ -1178,6 +1193,7 @@
             <w:pPr>
               <w:spacing w:after="60" w:lineRule="auto"/>
               <w:rPr/>
+              <w:jc w:val="left"/>
             </w:pPr>
             <w:r>
               <w:rPr>
@@ -1220,6 +1236,7 @@
             <w:pPr>
               <w:spacing w:after="80" w:lineRule="auto"/>
               <w:rPr/>
+              <w:jc w:val="left"/>
             </w:pPr>
             <w:r>
               <w:rPr>
@@ -1248,6 +1265,7 @@
                 <w:sz w:val="22"/>
                 <w:szCs w:val="22"/>
               </w:rPr>
+              <w:jc w:val="left"/>
             </w:pPr>
             <w:r>
               <w:rPr>
@@ -1613,6 +1631,7 @@
               <w:rPr>
                 <w:color w:val="ffffff"/>
               </w:rPr>
+              <w:jc w:val="left"/>
             </w:pPr>
             <w:r>
               <w:rPr>
@@ -1865,6 +1884,7 @@
               <w:rPr>
                 <w:color w:val="ffffff"/>
               </w:rPr>
+              <w:jc w:val="left"/>
             </w:pPr>
             <w:r>
               <w:rPr>
@@ -2092,6 +2112,7 @@
               <w:rPr>
                 <w:color w:val="ffffff"/>
               </w:rPr>
+              <w:jc w:val="left"/>
             </w:pPr>
             <w:r>
               <w:rPr>
@@ -2234,6 +2255,7 @@
               <w:rPr>
                 <w:color w:val="ffffff"/>
               </w:rPr>
+              <w:jc w:val="left"/>
             </w:pPr>
             <w:r>
               <w:rPr>
@@ -2424,6 +2446,7 @@
               <w:rPr>
                 <w:color w:val="ffffff"/>
               </w:rPr>
+              <w:jc w:val="left"/>
             </w:pPr>
             <w:r>
               <w:rPr>
@@ -2546,6 +2569,7 @@
               <w:rPr>
                 <w:color w:val="ffffff"/>
               </w:rPr>
+              <w:jc w:val="left"/>
             </w:pPr>
             <w:r>
               <w:rPr>
@@ -4967,7 +4991,7 @@
           </w:tcPr>
           <w:p>
             <w:pPr>
-              <w:jc w:val="center"/>
+              <w:jc w:val="left"/>
               <w:rPr>
                 <w:b w:val="1"/>
                 <w:bCs w:val="1"/>
@@ -5005,7 +5029,7 @@
           </w:tcPr>
           <w:p>
             <w:pPr>
-              <w:jc w:val="center"/>
+              <w:jc w:val="left"/>
               <w:rPr>
                 <w:b w:val="1"/>
                 <w:bCs w:val="1"/>
@@ -5056,6 +5080,7 @@
                 <w:sz w:val="26"/>
                 <w:szCs w:val="26"/>
               </w:rPr>
+              <w:jc w:val="left"/>
             </w:pPr>
             <w:r>
               <w:rPr>
@@ -5093,6 +5118,7 @@
                 <w:sz w:val="26"/>
                 <w:szCs w:val="26"/>
               </w:rPr>
+              <w:jc w:val="left"/>
             </w:pPr>
             <w:r>
               <w:rPr>
@@ -5137,6 +5163,7 @@
                 <w:sz w:val="26"/>
                 <w:szCs w:val="26"/>
               </w:rPr>
+              <w:jc w:val="left"/>
             </w:pPr>
             <w:r>
               <w:rPr>
@@ -5174,6 +5201,7 @@
                 <w:sz w:val="26"/>
                 <w:szCs w:val="26"/>
               </w:rPr>
+              <w:jc w:val="left"/>
             </w:pPr>
             <w:r>
               <w:rPr>
@@ -5218,6 +5246,7 @@
                 <w:sz w:val="26"/>
                 <w:szCs w:val="26"/>
               </w:rPr>
+              <w:jc w:val="left"/>
             </w:pPr>
             <w:r>
               <w:rPr>
@@ -5255,6 +5284,7 @@
                 <w:sz w:val="26"/>
                 <w:szCs w:val="26"/>
               </w:rPr>
+              <w:jc w:val="left"/>
             </w:pPr>
             <w:r>
               <w:rPr>
@@ -5300,6 +5330,7 @@
                 <w:sz w:val="26"/>
                 <w:szCs w:val="26"/>
               </w:rPr>
+              <w:jc w:val="left"/>
             </w:pPr>
             <w:r>
               <w:rPr>
@@ -5337,6 +5368,7 @@
                 <w:sz w:val="26"/>
                 <w:szCs w:val="26"/>
               </w:rPr>
+              <w:jc w:val="left"/>
             </w:pPr>
             <w:r>
               <w:rPr>
@@ -5381,6 +5413,7 @@
                 <w:sz w:val="26"/>
                 <w:szCs w:val="26"/>
               </w:rPr>
+              <w:jc w:val="left"/>
             </w:pPr>
             <w:r>
               <w:rPr>
@@ -5418,6 +5451,7 @@
                 <w:sz w:val="26"/>
                 <w:szCs w:val="26"/>
               </w:rPr>
+              <w:jc w:val="left"/>
             </w:pPr>
             <w:r>
               <w:rPr>
@@ -5462,6 +5496,7 @@
                 <w:sz w:val="26"/>
                 <w:szCs w:val="26"/>
               </w:rPr>
+              <w:jc w:val="left"/>
             </w:pPr>
             <w:r>
               <w:rPr>
@@ -5499,6 +5534,7 @@
                 <w:sz w:val="26"/>
                 <w:szCs w:val="26"/>
               </w:rPr>
+              <w:jc w:val="left"/>
             </w:pPr>
             <w:r>
               <w:rPr>
@@ -5543,6 +5579,7 @@
                 <w:sz w:val="26"/>
                 <w:szCs w:val="26"/>
               </w:rPr>
+              <w:jc w:val="left"/>
             </w:pPr>
             <w:r>
               <w:rPr>
@@ -5580,6 +5617,7 @@
                 <w:sz w:val="26"/>
                 <w:szCs w:val="26"/>
               </w:rPr>
+              <w:jc w:val="left"/>
             </w:pPr>
             <w:r>
               <w:rPr>
@@ -5624,6 +5662,7 @@
                 <w:sz w:val="26"/>
                 <w:szCs w:val="26"/>
               </w:rPr>
+              <w:jc w:val="left"/>
             </w:pPr>
             <w:r>
               <w:rPr>
@@ -5661,6 +5700,7 @@
                 <w:sz w:val="26"/>
                 <w:szCs w:val="26"/>
               </w:rPr>
+              <w:jc w:val="left"/>
             </w:pPr>
             <w:r>
               <w:rPr>
@@ -5705,6 +5745,7 @@
                 <w:sz w:val="26"/>
                 <w:szCs w:val="26"/>
               </w:rPr>
+              <w:jc w:val="left"/>
             </w:pPr>
             <w:r>
               <w:rPr>
@@ -5742,6 +5783,7 @@
                 <w:sz w:val="26"/>
                 <w:szCs w:val="26"/>
               </w:rPr>
+              <w:jc w:val="left"/>
             </w:pPr>
             <w:r>
               <w:rPr>
@@ -5786,6 +5828,7 @@
                 <w:sz w:val="26"/>
                 <w:szCs w:val="26"/>
               </w:rPr>
+              <w:jc w:val="left"/>
             </w:pPr>
             <w:r>
               <w:rPr>
@@ -5823,6 +5866,7 @@
                 <w:sz w:val="26"/>
                 <w:szCs w:val="26"/>
               </w:rPr>
+              <w:jc w:val="left"/>
             </w:pPr>
             <w:r>
               <w:rPr>
@@ -5867,6 +5911,7 @@
                 <w:sz w:val="26"/>
                 <w:szCs w:val="26"/>
               </w:rPr>
+              <w:jc w:val="left"/>
             </w:pPr>
             <w:r>
               <w:rPr>
@@ -5904,6 +5949,7 @@
                 <w:sz w:val="26"/>
                 <w:szCs w:val="26"/>
               </w:rPr>
+              <w:jc w:val="left"/>
             </w:pPr>
             <w:r>
               <w:rPr>
@@ -5948,6 +5994,7 @@
                 <w:sz w:val="26"/>
                 <w:szCs w:val="26"/>
               </w:rPr>
+              <w:jc w:val="left"/>
             </w:pPr>
             <w:r>
               <w:rPr>
@@ -5985,6 +6032,7 @@
                 <w:sz w:val="26"/>
                 <w:szCs w:val="26"/>
               </w:rPr>
+              <w:jc w:val="left"/>
             </w:pPr>
             <w:r>
               <w:rPr>
@@ -6029,6 +6077,7 @@
                 <w:sz w:val="26"/>
                 <w:szCs w:val="26"/>
               </w:rPr>
+              <w:jc w:val="left"/>
             </w:pPr>
             <w:r>
               <w:rPr>
@@ -6066,6 +6115,7 @@
                 <w:sz w:val="26"/>
                 <w:szCs w:val="26"/>
               </w:rPr>
+              <w:jc w:val="left"/>
             </w:pPr>
             <w:r>
               <w:rPr>
@@ -6110,6 +6160,7 @@
                 <w:sz w:val="26"/>
                 <w:szCs w:val="26"/>
               </w:rPr>
+              <w:jc w:val="left"/>
             </w:pPr>
             <w:r>
               <w:rPr>
@@ -6147,6 +6198,7 @@
                 <w:sz w:val="26"/>
                 <w:szCs w:val="26"/>
               </w:rPr>
+              <w:jc w:val="left"/>
             </w:pPr>
             <w:r>
               <w:rPr>
@@ -6191,6 +6243,7 @@
                 <w:sz w:val="26"/>
                 <w:szCs w:val="26"/>
               </w:rPr>
+              <w:jc w:val="left"/>
             </w:pPr>
             <w:r>
               <w:rPr>
@@ -6228,6 +6281,7 @@
                 <w:sz w:val="26"/>
                 <w:szCs w:val="26"/>
               </w:rPr>
+              <w:jc w:val="left"/>
             </w:pPr>
             <w:r>
               <w:rPr>
@@ -6272,6 +6326,7 @@
                 <w:sz w:val="26"/>
                 <w:szCs w:val="26"/>
               </w:rPr>
+              <w:jc w:val="left"/>
             </w:pPr>
             <w:r>
               <w:rPr>
@@ -6309,6 +6364,7 @@
                 <w:sz w:val="26"/>
                 <w:szCs w:val="26"/>
               </w:rPr>
+              <w:jc w:val="left"/>
             </w:pPr>
             <w:r>
               <w:rPr>

</xml_diff>

<commit_message>
Add user password change and fix report layout plus special-character rendering.
Let logged-in users change their password, put Detailed Vastu Analysis before Room Wise Analysis with therapy in that column, add a notes box, and sanitize rule text so quotes and slashes render in PDF and Word.
</commit_message>
<xml_diff>
--- a/app/services/templates/report_en.docx
+++ b/app/services/templates/report_en.docx
@@ -1346,7 +1346,369 @@
           <w:szCs w:val="26"/>
           <w:rtl w:val="0"/>
         </w:rPr>
-        <w:t xml:space="preserve">5. Room Wise Analysis</w:t>
+        <w:t xml:space="preserve">5. Detailed Vastu Analysis</w:t>
+      </w:r>
+      <w:r>
+        <w:rPr>
+          <w:rtl w:val="0"/>
+        </w:rPr>
+      </w:r>
+    </w:p>
+    <w:p>
+      <w:pPr>
+        <w:spacing w:after="80" w:before="0" w:lineRule="auto"/>
+        <w:jc w:val="left"/>
+        <w:rPr>
+          <w:color w:val="ffffff"/>
+        </w:rPr>
+      </w:pPr>
+      <w:r>
+        <w:rPr>
+          <w:rFonts w:ascii="Arial" w:cs="Arial" w:eastAsia="Arial" w:hAnsi="Arial"/>
+          <w:b w:val="0"/>
+          <w:bCs w:val="0"/>
+          <w:i w:val="1"/>
+          <w:iCs w:val="1"/>
+          <w:color w:val="ffffff"/>
+          <w:sz w:val="16"/>
+          <w:szCs w:val="16"/>
+          <w:rtl w:val="0"/>
+        </w:rPr>
+        <w:t xml:space="preserve">(Python prep: rating_pairs = [ratings[i:i+2] for i in range(0, len(ratings), 2)])</w:t>
+      </w:r>
+      <w:r>
+        <w:rPr>
+          <w:rtl w:val="0"/>
+        </w:rPr>
+      </w:r>
+    </w:p>
+    <w:tbl>
+      <w:tblPr>
+        <w:tblStyle w:val="Table6"/>
+        <w:tblW w:w="10466.0" w:type="dxa"/>
+        <w:jc w:val="left"/>
+        <w:tblBorders>
+          <w:top w:color="000000" w:space="0" w:sz="4" w:val="single"/>
+          <w:left w:color="000000" w:space="0" w:sz="4" w:val="single"/>
+          <w:bottom w:color="000000" w:space="0" w:sz="4" w:val="single"/>
+          <w:right w:color="000000" w:space="0" w:sz="4" w:val="single"/>
+          <w:insideH w:color="000000" w:space="0" w:sz="4" w:val="single"/>
+          <w:insideV w:color="000000" w:space="0" w:sz="4" w:val="single"/>
+        </w:tblBorders>
+        <w:tblLayout w:type="fixed"/>
+        <w:tblLook w:val="0000"/>
+      </w:tblPr>
+      <w:tblGrid>
+        <w:gridCol w:w="5233"/>
+        <w:gridCol w:w="5233"/>
+        <w:tblGridChange w:id="0">
+          <w:tblGrid>
+            <w:gridCol w:w="5233"/>
+            <w:gridCol w:w="5233"/>
+          </w:tblGrid>
+        </w:tblGridChange>
+      </w:tblGrid>
+      <w:tr>
+        <w:trPr>
+          <w:cantSplit w:val="0"/>
+          <w:tblHeader w:val="0"/>
+        </w:trPr>
+        <w:tc>
+          <w:tcPr>
+            <w:tcBorders>
+              <w:top w:color="e4d8cb" w:space="0" w:sz="4" w:val="single"/>
+              <w:left w:color="e4d8cb" w:space="0" w:sz="4" w:val="single"/>
+              <w:bottom w:color="e4d8cb" w:space="0" w:sz="4" w:val="single"/>
+              <w:right w:color="e4d8cb" w:space="0" w:sz="4" w:val="single"/>
+            </w:tcBorders>
+            <w:shd w:fill="5b3a22" w:val="clear"/>
+            <w:tcMar>
+              <w:top w:w="80.0" w:type="dxa"/>
+              <w:left w:w="120.0" w:type="dxa"/>
+              <w:bottom w:w="80.0" w:type="dxa"/>
+              <w:right w:w="120.0" w:type="dxa"/>
+            </w:tcMar>
+            <w:vAlign w:val="top"/>
+          </w:tcPr>
+          <w:p>
+            <w:pPr>
+              <w:spacing w:after="60" w:before="0" w:lineRule="auto"/>
+              <w:jc w:val="left"/>
+              <w:rPr/>
+            </w:pPr>
+            <w:r>
+              <w:rPr>
+                <w:rFonts w:ascii="Arial" w:cs="Arial" w:eastAsia="Arial" w:hAnsi="Arial"/>
+                <w:b w:val="1"/>
+                <w:bCs w:val="1"/>
+                <w:i w:val="0"/>
+                <w:iCs w:val="0"/>
+                <w:color w:val="ffffff"/>
+                <w:sz w:val="20"/>
+                <w:szCs w:val="20"/>
+                <w:rtl w:val="0"/>
+              </w:rPr>
+              <w:t xml:space="preserve">Room / Direction</w:t>
+            </w:r>
+            <w:r>
+              <w:rPr>
+                <w:rtl w:val="0"/>
+              </w:rPr>
+            </w:r>
+          </w:p>
+        </w:tc>
+        <w:tc>
+          <w:tcPr>
+            <w:tcBorders>
+              <w:top w:color="e4d8cb" w:space="0" w:sz="4" w:val="single"/>
+              <w:left w:color="e4d8cb" w:space="0" w:sz="4" w:val="single"/>
+              <w:bottom w:color="e4d8cb" w:space="0" w:sz="4" w:val="single"/>
+              <w:right w:color="e4d8cb" w:space="0" w:sz="4" w:val="single"/>
+            </w:tcBorders>
+            <w:shd w:fill="5b3a22" w:val="clear"/>
+            <w:tcMar>
+              <w:top w:w="80.0" w:type="dxa"/>
+              <w:left w:w="120.0" w:type="dxa"/>
+              <w:bottom w:w="80.0" w:type="dxa"/>
+              <w:right w:w="120.0" w:type="dxa"/>
+            </w:tcMar>
+            <w:vAlign w:val="top"/>
+          </w:tcPr>
+          <w:p>
+            <w:pPr>
+              <w:spacing w:after="60" w:before="0" w:lineRule="auto"/>
+              <w:jc w:val="left"/>
+              <w:rPr/>
+            </w:pPr>
+            <w:r>
+              <w:rPr>
+                <w:rFonts w:ascii="Arial" w:cs="Arial" w:eastAsia="Arial" w:hAnsi="Arial"/>
+                <w:b w:val="1"/>
+                <w:bCs w:val="1"/>
+                <w:i w:val="0"/>
+                <w:iCs w:val="0"/>
+                <w:color w:val="ffffff"/>
+                <w:sz w:val="20"/>
+                <w:szCs w:val="20"/>
+                <w:rtl w:val="0"/>
+              </w:rPr>
+              <w:t xml:space="preserve">Room / Direction</w:t>
+            </w:r>
+            <w:r>
+              <w:rPr>
+                <w:rtl w:val="0"/>
+              </w:rPr>
+            </w:r>
+          </w:p>
+        </w:tc>
+      </w:tr>
+      <w:tr>
+        <w:trPr>
+          <w:cantSplit w:val="0"/>
+          <w:tblHeader w:val="0"/>
+        </w:trPr>
+        <w:tc>
+          <w:tcPr>
+            <w:tcBorders>
+              <w:top w:color="000000" w:space="0" w:sz="0" w:val="nil"/>
+              <w:left w:color="000000" w:space="0" w:sz="0" w:val="nil"/>
+              <w:bottom w:color="000000" w:space="0" w:sz="0" w:val="nil"/>
+              <w:right w:color="000000" w:space="0" w:sz="0" w:val="nil"/>
+            </w:tcBorders>
+          </w:tcPr>
+          <w:p>
+            <w:pPr>
+              <w:rPr>
+                <w:color w:val="ffffff"/>
+              </w:rPr>
+              <w:jc w:val="left"/>
+            </w:pPr>
+            <w:r>
+              <w:rPr>
+                <w:color w:val="ffffff"/>
+                <w:rtl w:val="0"/>
+              </w:rPr>
+              <w:t xml:space="preserve">{%tr for pair in rating_pairs %}</w:t>
+            </w:r>
+          </w:p>
+        </w:tc>
+      </w:tr>
+      <w:tr>
+        <w:trPr>
+          <w:cantSplit w:val="0"/>
+          <w:trHeight w:val="360" w:hRule="atLeast"/>
+          <w:tblHeader w:val="0"/>
+        </w:trPr>
+        <w:tc>
+          <w:tcPr>
+            <w:gridSpan w:val="2"/>
+            <w:tcBorders>
+              <w:top w:color="e4d8cb" w:space="0" w:sz="4" w:val="single"/>
+              <w:left w:color="e4d8cb" w:space="0" w:sz="4" w:val="single"/>
+              <w:bottom w:color="e4d8cb" w:space="0" w:sz="4" w:val="single"/>
+              <w:right w:color="e4d8cb" w:space="0" w:sz="4" w:val="single"/>
+            </w:tcBorders>
+            <w:shd w:fill="faf7f2" w:val="clear"/>
+            <w:tcMar>
+              <w:top w:w="80.0" w:type="dxa"/>
+              <w:left w:w="120.0" w:type="dxa"/>
+              <w:bottom w:w="80.0" w:type="dxa"/>
+              <w:right w:w="120.0" w:type="dxa"/>
+            </w:tcMar>
+            <w:vAlign w:val="top"/>
+          </w:tcPr>
+          <w:p>
+            <w:pPr>
+              <w:spacing w:after="20" w:before="0" w:lineRule="auto"/>
+              <w:jc w:val="left"/>
+              <w:rPr>
+                <w:b w:val="1"/>
+                <w:bCs w:val="1"/>
+              </w:rPr>
+            </w:pPr>
+            <w:r>
+              <w:rPr>
+                <w:b w:val="1"/>
+                <w:bCs w:val="1"/>
+                <w:color w:val="5b3a22"/>
+                <w:rtl w:val="0"/>
+              </w:rPr>
+              <w:t xml:space="preserve">{{ pair[0].name }}</w:t>
+            </w:r>
+            <w:r>
+              <w:rPr>
+                <w:b w:val="1"/>
+                <w:bCs w:val="1"/>
+                <w:color w:val="5b3a22"/>
+                <w:rtl w:val="0"/>
+              </w:rPr>
+              <w:t xml:space="preserve"> </w:t>
+            </w:r>
+            <w:r>
+              <w:rPr>
+                <w:rFonts w:ascii="Arial" w:cs="Arial" w:eastAsia="Arial" w:hAnsi="Arial"/>
+                <w:b w:val="0"/>
+                <w:bCs w:val="0"/>
+                <w:i w:val="0"/>
+                <w:iCs w:val="0"/>
+                <w:color w:val="5b3a22"/>
+                <w:sz w:val="20"/>
+                <w:szCs w:val="20"/>
+                <w:rtl w:val="0"/>
+              </w:rPr>
+              <w:t xml:space="preserve">— </w:t>
+            </w:r>
+            <w:r>
+              <w:rPr>
+                <w:b w:val="1"/>
+                <w:bCs w:val="1"/>
+                <w:i w:val="0"/>
+                <w:iCs w:val="0"/>
+                <w:color w:val="5b3a22"/>
+                <w:sz w:val="20"/>
+                <w:szCs w:val="20"/>
+                <w:rtl w:val="0"/>
+              </w:rPr>
+              <w:t xml:space="preserve">{{ pair[0].direction }}</w:t>
+            </w:r>
+            <w:r>
+              <w:rPr>
+                <w:rtl w:val="0"/>
+              </w:rPr>
+            </w:r>
+          </w:p>
+          <w:p>
+            <w:pPr>
+              <w:spacing w:after="60" w:before="0" w:lineRule="auto"/>
+              <w:jc w:val="left"/>
+              <w:rPr/>
+            </w:pPr>
+            <w:r>
+              <w:rPr>
+                <w:rFonts w:ascii="Arial" w:cs="Arial" w:eastAsia="Arial" w:hAnsi="Arial"/>
+                <w:b w:val="0"/>
+                <w:bCs w:val="0"/>
+                <w:i w:val="0"/>
+                <w:iCs w:val="0"/>
+                <w:color w:val="2b2b2b"/>
+                <w:sz w:val="20"/>
+                <w:szCs w:val="20"/>
+                <w:rtl w:val="0"/>
+              </w:rPr>
+              <w:t xml:space="preserve">{{ pair[0].analysis }}</w:t>
+            </w:r>
+            <w:r>
+              <w:rPr>
+                <w:rtl w:val="0"/>
+              </w:rPr>
+            </w:r>
+          </w:p>
+        </w:tc>
+      </w:tr>
+      <w:tr>
+        <w:trPr>
+          <w:cantSplit w:val="0"/>
+          <w:tblHeader w:val="0"/>
+        </w:trPr>
+        <w:tc>
+          <w:tcPr>
+            <w:tcBorders>
+              <w:top w:color="000000" w:space="0" w:sz="0" w:val="nil"/>
+              <w:left w:color="000000" w:space="0" w:sz="0" w:val="nil"/>
+              <w:bottom w:color="000000" w:space="0" w:sz="0" w:val="nil"/>
+              <w:right w:color="000000" w:space="0" w:sz="0" w:val="nil"/>
+            </w:tcBorders>
+          </w:tcPr>
+          <w:p>
+            <w:pPr>
+              <w:rPr>
+                <w:color w:val="ffffff"/>
+              </w:rPr>
+              <w:jc w:val="left"/>
+            </w:pPr>
+            <w:r>
+              <w:rPr>
+                <w:color w:val="ffffff"/>
+                <w:rtl w:val="0"/>
+              </w:rPr>
+              <w:t xml:space="preserve">{%tr endfor %}</w:t>
+            </w:r>
+          </w:p>
+        </w:tc>
+      </w:tr>
+    </w:tbl>
+    <w:p>
+      <w:pPr>
+        <w:spacing w:after="0" w:before="200" w:lineRule="auto"/>
+        <w:rPr/>
+      </w:pPr>
+      <w:r>
+        <w:rPr>
+          <w:rtl w:val="0"/>
+        </w:rPr>
+      </w:r>
+    </w:p>
+    <w:p>
+      <w:pPr>
+        <w:pBdr>
+          <w:bottom w:color="e4d8cb" w:space="0" w:sz="4" w:val="single"/>
+        </w:pBdr>
+        <w:spacing w:after="100" w:before="200" w:lineRule="auto"/>
+        <w:rPr/>
+      </w:pPr>
+      <w:r>
+        <w:rPr>
+          <w:rFonts w:ascii="Arial" w:cs="Arial" w:eastAsia="Arial" w:hAnsi="Arial"/>
+          <w:b w:val="1"/>
+          <w:bCs w:val="1"/>
+          <w:i w:val="0"/>
+          <w:iCs w:val="0"/>
+          <w:color w:val="5b3a22"/>
+          <w:sz w:val="26"/>
+          <w:szCs w:val="26"/>
+          <w:rtl w:val="0"/>
+        </w:rPr>
+        <w:t xml:space="preserve">6. Room Wise Analysis</w:t>
       </w:r>
       <w:r>
         <w:rPr>
@@ -1602,7 +1964,7 @@
                 <w:szCs w:val="20"/>
                 <w:rtl w:val="0"/>
               </w:rPr>
-              <w:t xml:space="preserve">Remedy</w:t>
+              <w:t xml:space="preserve">Remedy / Therapy</w:t>
             </w:r>
             <w:r>
               <w:rPr>
@@ -1910,368 +2272,6 @@
           <w:sz w:val="26"/>
           <w:szCs w:val="26"/>
         </w:rPr>
-      </w:pPr>
-      <w:r>
-        <w:rPr>
-          <w:rtl w:val="0"/>
-        </w:rPr>
-      </w:r>
-    </w:p>
-    <w:p>
-      <w:pPr>
-        <w:pBdr>
-          <w:bottom w:color="e4d8cb" w:space="0" w:sz="4" w:val="single"/>
-        </w:pBdr>
-        <w:spacing w:after="100" w:before="200" w:lineRule="auto"/>
-        <w:rPr/>
-      </w:pPr>
-      <w:r>
-        <w:rPr>
-          <w:rFonts w:ascii="Arial" w:cs="Arial" w:eastAsia="Arial" w:hAnsi="Arial"/>
-          <w:b w:val="1"/>
-          <w:bCs w:val="1"/>
-          <w:i w:val="0"/>
-          <w:iCs w:val="0"/>
-          <w:color w:val="5b3a22"/>
-          <w:sz w:val="26"/>
-          <w:szCs w:val="26"/>
-          <w:rtl w:val="0"/>
-        </w:rPr>
-        <w:t xml:space="preserve">6. Detailed Vastu Analysis</w:t>
-      </w:r>
-      <w:r>
-        <w:rPr>
-          <w:rtl w:val="0"/>
-        </w:rPr>
-      </w:r>
-    </w:p>
-    <w:p>
-      <w:pPr>
-        <w:spacing w:after="80" w:before="0" w:lineRule="auto"/>
-        <w:jc w:val="left"/>
-        <w:rPr>
-          <w:color w:val="ffffff"/>
-        </w:rPr>
-      </w:pPr>
-      <w:r>
-        <w:rPr>
-          <w:rFonts w:ascii="Arial" w:cs="Arial" w:eastAsia="Arial" w:hAnsi="Arial"/>
-          <w:b w:val="0"/>
-          <w:bCs w:val="0"/>
-          <w:i w:val="1"/>
-          <w:iCs w:val="1"/>
-          <w:color w:val="ffffff"/>
-          <w:sz w:val="16"/>
-          <w:szCs w:val="16"/>
-          <w:rtl w:val="0"/>
-        </w:rPr>
-        <w:t xml:space="preserve">(Python prep: rating_pairs = [ratings[i:i+2] for i in range(0, len(ratings), 2)])</w:t>
-      </w:r>
-      <w:r>
-        <w:rPr>
-          <w:rtl w:val="0"/>
-        </w:rPr>
-      </w:r>
-    </w:p>
-    <w:tbl>
-      <w:tblPr>
-        <w:tblStyle w:val="Table6"/>
-        <w:tblW w:w="10466.0" w:type="dxa"/>
-        <w:jc w:val="left"/>
-        <w:tblBorders>
-          <w:top w:color="000000" w:space="0" w:sz="4" w:val="single"/>
-          <w:left w:color="000000" w:space="0" w:sz="4" w:val="single"/>
-          <w:bottom w:color="000000" w:space="0" w:sz="4" w:val="single"/>
-          <w:right w:color="000000" w:space="0" w:sz="4" w:val="single"/>
-          <w:insideH w:color="000000" w:space="0" w:sz="4" w:val="single"/>
-          <w:insideV w:color="000000" w:space="0" w:sz="4" w:val="single"/>
-        </w:tblBorders>
-        <w:tblLayout w:type="fixed"/>
-        <w:tblLook w:val="0000"/>
-      </w:tblPr>
-      <w:tblGrid>
-        <w:gridCol w:w="5233"/>
-        <w:gridCol w:w="5233"/>
-        <w:tblGridChange w:id="0">
-          <w:tblGrid>
-            <w:gridCol w:w="5233"/>
-            <w:gridCol w:w="5233"/>
-          </w:tblGrid>
-        </w:tblGridChange>
-      </w:tblGrid>
-      <w:tr>
-        <w:trPr>
-          <w:cantSplit w:val="0"/>
-          <w:tblHeader w:val="0"/>
-        </w:trPr>
-        <w:tc>
-          <w:tcPr>
-            <w:tcBorders>
-              <w:top w:color="e4d8cb" w:space="0" w:sz="4" w:val="single"/>
-              <w:left w:color="e4d8cb" w:space="0" w:sz="4" w:val="single"/>
-              <w:bottom w:color="e4d8cb" w:space="0" w:sz="4" w:val="single"/>
-              <w:right w:color="e4d8cb" w:space="0" w:sz="4" w:val="single"/>
-            </w:tcBorders>
-            <w:shd w:fill="5b3a22" w:val="clear"/>
-            <w:tcMar>
-              <w:top w:w="80.0" w:type="dxa"/>
-              <w:left w:w="120.0" w:type="dxa"/>
-              <w:bottom w:w="80.0" w:type="dxa"/>
-              <w:right w:w="120.0" w:type="dxa"/>
-            </w:tcMar>
-            <w:vAlign w:val="top"/>
-          </w:tcPr>
-          <w:p>
-            <w:pPr>
-              <w:spacing w:after="60" w:before="0" w:lineRule="auto"/>
-              <w:jc w:val="left"/>
-              <w:rPr/>
-            </w:pPr>
-            <w:r>
-              <w:rPr>
-                <w:rFonts w:ascii="Arial" w:cs="Arial" w:eastAsia="Arial" w:hAnsi="Arial"/>
-                <w:b w:val="1"/>
-                <w:bCs w:val="1"/>
-                <w:i w:val="0"/>
-                <w:iCs w:val="0"/>
-                <w:color w:val="ffffff"/>
-                <w:sz w:val="20"/>
-                <w:szCs w:val="20"/>
-                <w:rtl w:val="0"/>
-              </w:rPr>
-              <w:t xml:space="preserve">Room / Direction</w:t>
-            </w:r>
-            <w:r>
-              <w:rPr>
-                <w:rtl w:val="0"/>
-              </w:rPr>
-            </w:r>
-          </w:p>
-        </w:tc>
-        <w:tc>
-          <w:tcPr>
-            <w:tcBorders>
-              <w:top w:color="e4d8cb" w:space="0" w:sz="4" w:val="single"/>
-              <w:left w:color="e4d8cb" w:space="0" w:sz="4" w:val="single"/>
-              <w:bottom w:color="e4d8cb" w:space="0" w:sz="4" w:val="single"/>
-              <w:right w:color="e4d8cb" w:space="0" w:sz="4" w:val="single"/>
-            </w:tcBorders>
-            <w:shd w:fill="5b3a22" w:val="clear"/>
-            <w:tcMar>
-              <w:top w:w="80.0" w:type="dxa"/>
-              <w:left w:w="120.0" w:type="dxa"/>
-              <w:bottom w:w="80.0" w:type="dxa"/>
-              <w:right w:w="120.0" w:type="dxa"/>
-            </w:tcMar>
-            <w:vAlign w:val="top"/>
-          </w:tcPr>
-          <w:p>
-            <w:pPr>
-              <w:spacing w:after="60" w:before="0" w:lineRule="auto"/>
-              <w:jc w:val="left"/>
-              <w:rPr/>
-            </w:pPr>
-            <w:r>
-              <w:rPr>
-                <w:rFonts w:ascii="Arial" w:cs="Arial" w:eastAsia="Arial" w:hAnsi="Arial"/>
-                <w:b w:val="1"/>
-                <w:bCs w:val="1"/>
-                <w:i w:val="0"/>
-                <w:iCs w:val="0"/>
-                <w:color w:val="ffffff"/>
-                <w:sz w:val="20"/>
-                <w:szCs w:val="20"/>
-                <w:rtl w:val="0"/>
-              </w:rPr>
-              <w:t xml:space="preserve">Room / Direction</w:t>
-            </w:r>
-            <w:r>
-              <w:rPr>
-                <w:rtl w:val="0"/>
-              </w:rPr>
-            </w:r>
-          </w:p>
-        </w:tc>
-      </w:tr>
-      <w:tr>
-        <w:trPr>
-          <w:cantSplit w:val="0"/>
-          <w:tblHeader w:val="0"/>
-        </w:trPr>
-        <w:tc>
-          <w:tcPr>
-            <w:tcBorders>
-              <w:top w:color="000000" w:space="0" w:sz="0" w:val="nil"/>
-              <w:left w:color="000000" w:space="0" w:sz="0" w:val="nil"/>
-              <w:bottom w:color="000000" w:space="0" w:sz="0" w:val="nil"/>
-              <w:right w:color="000000" w:space="0" w:sz="0" w:val="nil"/>
-            </w:tcBorders>
-          </w:tcPr>
-          <w:p>
-            <w:pPr>
-              <w:rPr>
-                <w:color w:val="ffffff"/>
-              </w:rPr>
-              <w:jc w:val="left"/>
-            </w:pPr>
-            <w:r>
-              <w:rPr>
-                <w:color w:val="ffffff"/>
-                <w:rtl w:val="0"/>
-              </w:rPr>
-              <w:t xml:space="preserve">{%tr for pair in rating_pairs %}</w:t>
-            </w:r>
-          </w:p>
-        </w:tc>
-      </w:tr>
-      <w:tr>
-        <w:trPr>
-          <w:cantSplit w:val="0"/>
-          <w:trHeight w:val="360" w:hRule="atLeast"/>
-          <w:tblHeader w:val="0"/>
-        </w:trPr>
-        <w:tc>
-          <w:tcPr>
-            <w:gridSpan w:val="2"/>
-            <w:tcBorders>
-              <w:top w:color="e4d8cb" w:space="0" w:sz="4" w:val="single"/>
-              <w:left w:color="e4d8cb" w:space="0" w:sz="4" w:val="single"/>
-              <w:bottom w:color="e4d8cb" w:space="0" w:sz="4" w:val="single"/>
-              <w:right w:color="e4d8cb" w:space="0" w:sz="4" w:val="single"/>
-            </w:tcBorders>
-            <w:shd w:fill="faf7f2" w:val="clear"/>
-            <w:tcMar>
-              <w:top w:w="80.0" w:type="dxa"/>
-              <w:left w:w="120.0" w:type="dxa"/>
-              <w:bottom w:w="80.0" w:type="dxa"/>
-              <w:right w:w="120.0" w:type="dxa"/>
-            </w:tcMar>
-            <w:vAlign w:val="top"/>
-          </w:tcPr>
-          <w:p>
-            <w:pPr>
-              <w:spacing w:after="20" w:before="0" w:lineRule="auto"/>
-              <w:jc w:val="left"/>
-              <w:rPr>
-                <w:b w:val="1"/>
-                <w:bCs w:val="1"/>
-              </w:rPr>
-            </w:pPr>
-            <w:r>
-              <w:rPr>
-                <w:b w:val="1"/>
-                <w:bCs w:val="1"/>
-                <w:color w:val="5b3a22"/>
-                <w:rtl w:val="0"/>
-              </w:rPr>
-              <w:t xml:space="preserve">{{ pair[0].name }}</w:t>
-            </w:r>
-            <w:r>
-              <w:rPr>
-                <w:b w:val="1"/>
-                <w:bCs w:val="1"/>
-                <w:color w:val="5b3a22"/>
-                <w:rtl w:val="0"/>
-              </w:rPr>
-              <w:t xml:space="preserve"> </w:t>
-            </w:r>
-            <w:r>
-              <w:rPr>
-                <w:rFonts w:ascii="Arial" w:cs="Arial" w:eastAsia="Arial" w:hAnsi="Arial"/>
-                <w:b w:val="0"/>
-                <w:bCs w:val="0"/>
-                <w:i w:val="0"/>
-                <w:iCs w:val="0"/>
-                <w:color w:val="5b3a22"/>
-                <w:sz w:val="20"/>
-                <w:szCs w:val="20"/>
-                <w:rtl w:val="0"/>
-              </w:rPr>
-              <w:t xml:space="preserve">— </w:t>
-            </w:r>
-            <w:r>
-              <w:rPr>
-                <w:b w:val="1"/>
-                <w:bCs w:val="1"/>
-                <w:i w:val="0"/>
-                <w:iCs w:val="0"/>
-                <w:color w:val="5b3a22"/>
-                <w:sz w:val="20"/>
-                <w:szCs w:val="20"/>
-                <w:rtl w:val="0"/>
-              </w:rPr>
-              <w:t xml:space="preserve">{{ pair[0].direction }}</w:t>
-            </w:r>
-            <w:r>
-              <w:rPr>
-                <w:rtl w:val="0"/>
-              </w:rPr>
-            </w:r>
-          </w:p>
-          <w:p>
-            <w:pPr>
-              <w:spacing w:after="60" w:before="0" w:lineRule="auto"/>
-              <w:jc w:val="left"/>
-              <w:rPr/>
-            </w:pPr>
-            <w:r>
-              <w:rPr>
-                <w:rFonts w:ascii="Arial" w:cs="Arial" w:eastAsia="Arial" w:hAnsi="Arial"/>
-                <w:b w:val="0"/>
-                <w:bCs w:val="0"/>
-                <w:i w:val="0"/>
-                <w:iCs w:val="0"/>
-                <w:color w:val="2b2b2b"/>
-                <w:sz w:val="20"/>
-                <w:szCs w:val="20"/>
-                <w:rtl w:val="0"/>
-              </w:rPr>
-              <w:t xml:space="preserve">{{ pair[0].analysis }}</w:t>
-            </w:r>
-            <w:r>
-              <w:rPr>
-                <w:rtl w:val="0"/>
-              </w:rPr>
-            </w:r>
-          </w:p>
-        </w:tc>
-      </w:tr>
-      <w:tr>
-        <w:trPr>
-          <w:cantSplit w:val="0"/>
-          <w:tblHeader w:val="0"/>
-        </w:trPr>
-        <w:tc>
-          <w:tcPr>
-            <w:tcBorders>
-              <w:top w:color="000000" w:space="0" w:sz="0" w:val="nil"/>
-              <w:left w:color="000000" w:space="0" w:sz="0" w:val="nil"/>
-              <w:bottom w:color="000000" w:space="0" w:sz="0" w:val="nil"/>
-              <w:right w:color="000000" w:space="0" w:sz="0" w:val="nil"/>
-            </w:tcBorders>
-          </w:tcPr>
-          <w:p>
-            <w:pPr>
-              <w:rPr>
-                <w:color w:val="ffffff"/>
-              </w:rPr>
-              <w:jc w:val="left"/>
-            </w:pPr>
-            <w:r>
-              <w:rPr>
-                <w:color w:val="ffffff"/>
-                <w:rtl w:val="0"/>
-              </w:rPr>
-              <w:t xml:space="preserve">{%tr endfor %}</w:t>
-            </w:r>
-          </w:p>
-        </w:tc>
-      </w:tr>
-    </w:tbl>
-    <w:p>
-      <w:pPr>
-        <w:spacing w:after="0" w:before="200" w:lineRule="auto"/>
-        <w:rPr/>
       </w:pPr>
       <w:r>
         <w:rPr>
@@ -2593,6 +2593,64 @@
         </w:rPr>
       </w:r>
     </w:p>
+    <w:p>
+      <w:pPr>
+        <w:spacing w:after="100" w:before="200"/>
+      </w:pPr>
+      <w:r>
+        <w:rPr>
+          <w:rFonts w:ascii="Arial" w:cs="Arial" w:eastAsia="Arial" w:hAnsi="Arial"/>
+          <w:b w:val="1"/>
+          <w:i w:val="0"/>
+          <w:color w:val="5b3a22"/>
+          <w:sz w:val="26"/>
+          <w:szCs w:val="26"/>
+        </w:rPr>
+        <w:t xml:space="preserve">Personalised Notes</w:t>
+      </w:r>
+    </w:p>
+    <w:tbl>
+      <w:tblPr>
+        <w:tblW w:w="10466" w:type="dxa"/>
+        <w:tblBorders>
+          <w:top w:color="e4d8cb" w:space="0" w:sz="8" w:val="single"/>
+          <w:left w:color="e4d8cb" w:space="0" w:sz="8" w:val="single"/>
+          <w:bottom w:color="e4d8cb" w:space="0" w:sz="8" w:val="single"/>
+          <w:right w:color="e4d8cb" w:space="0" w:sz="8" w:val="single"/>
+        </w:tblBorders>
+      </w:tblPr>
+      <w:tblGrid>
+        <w:gridCol w:w="10466"/>
+      </w:tblGrid>
+      <w:tr>
+        <w:trPr>
+          <w:trHeight w:val="7200" w:hRule="atLeast"/>
+        </w:trPr>
+        <w:tc>
+          <w:tcPr>
+            <w:tcW w:w="10466" w:type="dxa"/>
+            <w:shd w:val="clear" w:fill="FAF8F5"/>
+          </w:tcPr>
+          <w:p>
+            <w:pPr>
+              <w:spacing w:after="100" w:before="200"/>
+            </w:pPr>
+            <w:r>
+              <w:rPr>
+                <w:rFonts w:ascii="Arial" w:cs="Arial" w:eastAsia="Arial" w:hAnsi="Arial"/>
+                <w:b w:val="0"/>
+                <w:i w:val="1"/>
+                <w:color w:val="8a7a6a"/>
+                <w:sz w:val="18"/>
+                <w:szCs w:val="18"/>
+              </w:rPr>
+              <w:t xml:space="preserve">Space for the consultant / astrologer to add personalised notes.</w:t>
+            </w:r>
+          </w:p>
+        </w:tc>
+      </w:tr>
+    </w:tbl>
+    <w:p/>
     <w:p>
       <w:pPr>
         <w:pBdr>

</xml_diff>